<commit_message>
QC: regenerate report docx; graphify rebuild; drop stray LibreOffice lock file
Co-Authored-By: Claude Opus 5.5 <noreply@anthropic.com>
</commit_message>
<xml_diff>
--- a/QC_report/module-c-report.docx
+++ b/QC_report/module-c-report.docx
@@ -359,6 +359,19 @@
           <w:szCs w:val="22"/>
         </w:rPr>
         <w:t xml:space="preserve">10. Change record</w:t>
+      </w:r>
+    </w:p>
+    <w:p>
+      <w:pPr>
+        <w:spacing w:after="60"/>
+        <w:ind w:left="240"/>
+      </w:pPr>
+      <w:r>
+        <w:rPr>
+          <w:sz w:val="22"/>
+          <w:szCs w:val="22"/>
+        </w:rPr>
+        <w:t xml:space="preserve">11. Implementation status</w:t>
       </w:r>
     </w:p>
     <w:p>
@@ -3113,6 +3126,20 @@
         <w:t xml:space="preserve"> [C]. All of these were checked against the source.</w:t>
       </w:r>
     </w:p>
+    <w:p>
+      <w:pPr>
+        <w:bidi w:val="false"/>
+        <w:spacing w:after="100"/>
+      </w:pPr>
+      <w:r>
+        <w:rPr>
+          <w:i/>
+          <w:iCs/>
+          <w:rtl w:val="false"/>
+        </w:rPr>
+        <w:t xml:space="preserve">(r3, 2026-09-28: all 11 fixed in c-1.ts / c-2.ts. Plan step 1 is done. The table is kept as the record of what was wrong.)</w:t>
+      </w:r>
+    </w:p>
     <w:tbl>
       <w:tblPr>
         <w:bidiVisual w:val="0"/>
@@ -4547,6 +4574,20 @@
       </w:pPr>
       <w:r>
         <w:rPr>
+          <w:i/>
+          <w:iCs/>
+          <w:rtl w:val="false"/>
+        </w:rPr>
+        <w:t xml:space="preserve">(r3, 2026-09-28: fixed. About 35 items were rewritten with the content-2c pattern, and each has an explanation. Plan step 6 is done.)</w:t>
+      </w:r>
+    </w:p>
+    <w:p>
+      <w:pPr>
+        <w:bidi w:val="false"/>
+        <w:spacing w:after="100"/>
+      </w:pPr>
+      <w:r>
+        <w:rPr>
           <w:b/>
           <w:bCs/>
           <w:rtl w:val="false"/>
@@ -4623,6 +4664,20 @@
           <w:rtl w:val="false"/>
         </w:rPr>
         <w:t xml:space="preserve"> (the model answer is shown, nothing is scored).</w:t>
+      </w:r>
+    </w:p>
+    <w:p>
+      <w:pPr>
+        <w:bidi w:val="false"/>
+        <w:spacing w:after="100"/>
+      </w:pPr>
+      <w:r>
+        <w:rPr>
+          <w:i/>
+          <w:iCs/>
+          <w:rtl w:val="false"/>
+        </w:rPr>
+        <w:t xml:space="preserve">(r3, 2026-09-28: spelling part fixed. 48 listen-mode spelling screens were added: every vocab review round, plus 2 per vocab-test round, which is required. Copy mode is kept. vocab-test being mostly multiple choice and the unscored reading answers are still open: plan step 8.)</w:t>
       </w:r>
     </w:p>
     <w:p>
@@ -4714,6 +4769,132 @@
       </w:pPr>
       <w:r>
         <w:rPr>
+          <w:i/>
+          <w:iCs/>
+          <w:rtl w:val="false"/>
+        </w:rPr>
+        <w:t xml:space="preserve">(r4, 2026-09-28: prototyped on l06 + not-q only, for owner review. Roll out to the other reading nodes if approved. Claude's advice, in order: cut the 🌱 filler rounds and require a fresh-text exam round; write about 6 new texts on new topics; split numbers-names-q; end each marking drill with one real question.)</w:t>
+      </w:r>
+    </w:p>
+    <w:p>
+      <w:pPr>
+        <w:bidi w:val="false"/>
+        <w:spacing w:after="100"/>
+      </w:pPr>
+      <w:r>
+        <w:rPr>
+          <w:i/>
+          <w:iCs/>
+          <w:rtl w:val="false"/>
+        </w:rPr>
+        <w:t xml:space="preserve">(r5, 2026-09-28, owner review of the prototype:</w:t>
+      </w:r>
+    </w:p>
+    <w:p>
+      <w:pPr>
+        <w:bidi w:val="false"/>
+        <w:spacing w:after="100"/>
+      </w:pPr>
+      <w:r>
+        <w:rPr>
+          <w:i/>
+          <w:iCs/>
+          <w:rtl w:val="false"/>
+        </w:rPr>
+        <w:t xml:space="preserve">- </w:t>
+      </w:r>
+      <w:r>
+        <w:rPr>
+          <w:i/>
+          <w:iCs/>
+          <w:rtl w:val="false"/>
+        </w:rPr>
+        <w:t xml:space="preserve">Rounds:</w:t>
+      </w:r>
+      <w:r>
+        <w:rPr>
+          <w:rtl w:val="false"/>
+        </w:rPr>
+        <w:t xml:space="preserve">* optional rounds come only after the exam-level round.*</w:t>
+      </w:r>
+    </w:p>
+    <w:p>
+      <w:pPr>
+        <w:bidi w:val="false"/>
+        <w:spacing w:after="100"/>
+      </w:pPr>
+      <w:r>
+        <w:rPr>
+          <w:i/>
+          <w:iCs/>
+          <w:rtl w:val="false"/>
+        </w:rPr>
+        <w:t xml:space="preserve">- </w:t>
+      </w:r>
+      <w:r>
+        <w:rPr>
+          <w:i/>
+          <w:iCs/>
+          <w:rtl w:val="false"/>
+        </w:rPr>
+        <w:t xml:space="preserve">Drills stay about marking:</w:t>
+      </w:r>
+      <w:r>
+        <w:rPr>
+          <w:rtl w:val="false"/>
+        </w:rPr>
+        <w:t xml:space="preserve">* l06 now mixes in not-q's rules questions and ends with a 240-word marking text.*</w:t>
+      </w:r>
+    </w:p>
+    <w:p>
+      <w:pPr>
+        <w:bidi w:val="false"/>
+        <w:spacing w:after="100"/>
+      </w:pPr>
+      <w:r>
+        <w:rPr>
+          <w:i/>
+          <w:iCs/>
+          <w:rtl w:val="false"/>
+        </w:rPr>
+        <w:t xml:space="preserve">- </w:t>
+      </w:r>
+      <w:r>
+        <w:rPr>
+          <w:i/>
+          <w:iCs/>
+          <w:rtl w:val="false"/>
+        </w:rPr>
+        <w:t xml:space="preserve">Questions live in the -q node:</w:t>
+      </w:r>
+      <w:r>
+        <w:rPr>
+          <w:rtl w:val="false"/>
+        </w:rPr>
+        <w:t xml:space="preserve">* the short-text question moved to not-q, and not-q round 2 got 2 more NOT questions.*</w:t>
+      </w:r>
+    </w:p>
+    <w:p>
+      <w:pPr>
+        <w:bidi w:val="false"/>
+        <w:spacing w:after="100"/>
+      </w:pPr>
+      <w:r>
+        <w:rPr>
+          <w:i/>
+          <w:iCs/>
+          <w:rtl w:val="false"/>
+        </w:rPr>
+        <w:t xml:space="preserve">The earlier advice to "end each marking drill with one real question" is replaced by these rules.)</w:t>
+      </w:r>
+    </w:p>
+    <w:p>
+      <w:pPr>
+        <w:bidi w:val="false"/>
+        <w:spacing w:after="100"/>
+      </w:pPr>
+      <w:r>
+        <w:rPr>
           <w:b/>
           <w:bCs/>
           <w:rtl w:val="false"/>
@@ -4779,6 +4960,20 @@
       </w:pPr>
       <w:r>
         <w:rPr>
+          <w:i/>
+          <w:iCs/>
+          <w:rtl w:val="false"/>
+        </w:rPr>
+        <w:t xml:space="preserve">(r4, 2026-09-28, owner ruling: not an issue. These claims come from a real English teacher who wrote the content, so they count as sourced. Plan step 3 is closed without changes. The two reviewers' "unverified" label is kept above as the record.)</w:t>
+      </w:r>
+    </w:p>
+    <w:p>
+      <w:pPr>
+        <w:bidi w:val="false"/>
+        <w:spacing w:after="100"/>
+      </w:pPr>
+      <w:r>
+        <w:rPr>
           <w:b/>
           <w:bCs/>
           <w:rtl w:val="false"/>
@@ -4820,6 +5015,20 @@
           <w:rtl w:val="false"/>
         </w:rPr>
         <w:t xml:space="preserve"> since ce2e759, but l00 says "if you're here, you passed the words". The audit says to keep the gate.</w:t>
+      </w:r>
+    </w:p>
+    <w:p>
+      <w:pPr>
+        <w:bidi w:val="false"/>
+        <w:spacing w:after="100"/>
+      </w:pPr>
+      <w:r>
+        <w:rPr>
+          <w:i/>
+          <w:iCs/>
+          <w:rtl w:val="false"/>
+        </w:rPr>
+        <w:t xml:space="preserve">(r4, 2026-09-28: fixed as a parallel track, as both reviewers recommended. l00 stays open, its opening text is rewritten, and the audit's stated intent is updated. Plan step 5 and section 8 question 1 are done.)</w:t>
       </w:r>
     </w:p>
     <w:p>
@@ -4919,6 +5128,20 @@
           <w:rtl w:val="false"/>
         </w:rPr>
         <w:t xml:space="preserve">Nothing tells the student how long the route is [G].</w:t>
+      </w:r>
+    </w:p>
+    <w:p>
+      <w:pPr>
+        <w:bidi w:val="false"/>
+        <w:spacing w:after="100"/>
+      </w:pPr>
+      <w:r>
+        <w:rPr>
+          <w:i/>
+          <w:iCs/>
+          <w:rtl w:val="false"/>
+        </w:rPr>
+        <w:t xml:space="preserve">(r4, 2026-09-28: fixed. Typos, stray characters and broken bold are gone. Line breaks the editor had lost are restored in l02, l03, l07 and q-words-1. Drill counts are honest, and section intros give real lesson counts. Em-dashes are replaced. Also found and fixed: the l03 round 5 self-check asked about Dr. Klein on a Dr. Diallo text, with the answer in the prompt. Plan step 4 is done.)</w:t>
       </w:r>
     </w:p>
     <w:p>
@@ -9594,6 +9817,20 @@
     </w:p>
     <w:p>
       <w:pPr>
+        <w:bidi w:val="false"/>
+        <w:spacing w:after="100"/>
+      </w:pPr>
+      <w:r>
+        <w:rPr>
+          <w:i/>
+          <w:iCs/>
+          <w:rtl w:val="false"/>
+        </w:rPr>
+        <w:t xml:space="preserve">(r5: progress per step, and where to resume, are in section 11.)</w:t>
+      </w:r>
+    </w:p>
+    <w:p>
+      <w:pPr>
         <w:pStyle w:val="Heading2"/>
       </w:pPr>
       <w:r>
@@ -14449,6 +14686,706 @@
           </w:p>
         </w:tc>
       </w:tr>
+      <w:tr>
+        <w:trPr>
+          <w:tblHeader w:val="off"/>
+        </w:trPr>
+        <w:tc>
+          <w:tcPr>
+            <w:tcW w:type="dxa" w:w="786"/>
+            <w:tcBorders>
+              <w:top w:val="single" w:color="BBBBBB" w:sz="4"/>
+              <w:left w:val="single" w:color="BBBBBB" w:sz="4"/>
+              <w:bottom w:val="single" w:color="BBBBBB" w:sz="4"/>
+              <w:right w:val="single" w:color="BBBBBB" w:sz="4"/>
+            </w:tcBorders>
+            <w:tcMar>
+              <w:top w:type="dxa" w:w="60"/>
+              <w:left w:type="dxa" w:w="90"/>
+              <w:bottom w:type="dxa" w:w="60"/>
+              <w:right w:type="dxa" w:w="90"/>
+            </w:tcMar>
+          </w:tcPr>
+          <w:p>
+            <w:pPr>
+              <w:bidi w:val="false"/>
+            </w:pPr>
+            <w:r>
+              <w:rPr>
+                <w:sz w:val="18"/>
+                <w:szCs w:val="18"/>
+                <w:rtl w:val="false"/>
+              </w:rPr>
+              <w:t xml:space="preserve">2026-09-28</w:t>
+            </w:r>
+          </w:p>
+        </w:tc>
+        <w:tc>
+          <w:tcPr>
+            <w:tcW w:type="dxa" w:w="786"/>
+            <w:tcBorders>
+              <w:top w:val="single" w:color="BBBBBB" w:sz="4"/>
+              <w:left w:val="single" w:color="BBBBBB" w:sz="4"/>
+              <w:bottom w:val="single" w:color="BBBBBB" w:sz="4"/>
+              <w:right w:val="single" w:color="BBBBBB" w:sz="4"/>
+            </w:tcBorders>
+            <w:tcMar>
+              <w:top w:type="dxa" w:w="60"/>
+              <w:left w:type="dxa" w:w="90"/>
+              <w:bottom w:type="dxa" w:w="60"/>
+              <w:right w:type="dxa" w:w="90"/>
+            </w:tcMar>
+          </w:tcPr>
+          <w:p>
+            <w:pPr>
+              <w:bidi w:val="false"/>
+            </w:pPr>
+            <w:r>
+              <w:rPr>
+                <w:sz w:val="18"/>
+                <w:szCs w:val="18"/>
+                <w:rtl w:val="false"/>
+              </w:rPr>
+              <w:t xml:space="preserve">Claude</w:t>
+            </w:r>
+          </w:p>
+        </w:tc>
+        <w:tc>
+          <w:tcPr>
+            <w:tcW w:type="dxa" w:w="7788"/>
+            <w:tcBorders>
+              <w:top w:val="single" w:color="BBBBBB" w:sz="4"/>
+              <w:left w:val="single" w:color="BBBBBB" w:sz="4"/>
+              <w:bottom w:val="single" w:color="BBBBBB" w:sz="4"/>
+              <w:right w:val="single" w:color="BBBBBB" w:sz="4"/>
+            </w:tcBorders>
+            <w:tcMar>
+              <w:top w:type="dxa" w:w="60"/>
+              <w:left w:type="dxa" w:w="90"/>
+              <w:bottom w:type="dxa" w:w="60"/>
+              <w:right w:type="dxa" w:w="90"/>
+            </w:tcMar>
+          </w:tcPr>
+          <w:p>
+            <w:pPr>
+              <w:bidi w:val="false"/>
+            </w:pPr>
+            <w:r>
+              <w:rPr>
+                <w:sz w:val="18"/>
+                <w:szCs w:val="18"/>
+                <w:rtl w:val="false"/>
+              </w:rPr>
+              <w:t xml:space="preserve">Round 3 (implementation): fixed all 11 P1 items in the content (plan step 1). Grades not changed yet: re-grade after Phase 1 is complete</w:t>
+            </w:r>
+          </w:p>
+        </w:tc>
+      </w:tr>
+      <w:tr>
+        <w:trPr>
+          <w:tblHeader w:val="off"/>
+        </w:trPr>
+        <w:tc>
+          <w:tcPr>
+            <w:tcW w:type="dxa" w:w="786"/>
+            <w:tcBorders>
+              <w:top w:val="single" w:color="BBBBBB" w:sz="4"/>
+              <w:left w:val="single" w:color="BBBBBB" w:sz="4"/>
+              <w:bottom w:val="single" w:color="BBBBBB" w:sz="4"/>
+              <w:right w:val="single" w:color="BBBBBB" w:sz="4"/>
+            </w:tcBorders>
+            <w:tcMar>
+              <w:top w:type="dxa" w:w="60"/>
+              <w:left w:type="dxa" w:w="90"/>
+              <w:bottom w:type="dxa" w:w="60"/>
+              <w:right w:type="dxa" w:w="90"/>
+            </w:tcMar>
+          </w:tcPr>
+          <w:p>
+            <w:pPr>
+              <w:bidi w:val="false"/>
+            </w:pPr>
+            <w:r>
+              <w:rPr>
+                <w:sz w:val="18"/>
+                <w:szCs w:val="18"/>
+                <w:rtl w:val="false"/>
+              </w:rPr>
+              <w:t xml:space="preserve">2026-09-28</w:t>
+            </w:r>
+          </w:p>
+        </w:tc>
+        <w:tc>
+          <w:tcPr>
+            <w:tcW w:type="dxa" w:w="786"/>
+            <w:tcBorders>
+              <w:top w:val="single" w:color="BBBBBB" w:sz="4"/>
+              <w:left w:val="single" w:color="BBBBBB" w:sz="4"/>
+              <w:bottom w:val="single" w:color="BBBBBB" w:sz="4"/>
+              <w:right w:val="single" w:color="BBBBBB" w:sz="4"/>
+            </w:tcBorders>
+            <w:tcMar>
+              <w:top w:type="dxa" w:w="60"/>
+              <w:left w:type="dxa" w:w="90"/>
+              <w:bottom w:type="dxa" w:w="60"/>
+              <w:right w:type="dxa" w:w="90"/>
+            </w:tcMar>
+          </w:tcPr>
+          <w:p>
+            <w:pPr>
+              <w:bidi w:val="false"/>
+            </w:pPr>
+            <w:r>
+              <w:rPr>
+                <w:sz w:val="18"/>
+                <w:szCs w:val="18"/>
+                <w:rtl w:val="false"/>
+              </w:rPr>
+              <w:t xml:space="preserve">Claude</w:t>
+            </w:r>
+          </w:p>
+        </w:tc>
+        <w:tc>
+          <w:tcPr>
+            <w:tcW w:type="dxa" w:w="7788"/>
+            <w:tcBorders>
+              <w:top w:val="single" w:color="BBBBBB" w:sz="4"/>
+              <w:left w:val="single" w:color="BBBBBB" w:sz="4"/>
+              <w:bottom w:val="single" w:color="BBBBBB" w:sz="4"/>
+              <w:right w:val="single" w:color="BBBBBB" w:sz="4"/>
+            </w:tcBorders>
+            <w:tcMar>
+              <w:top w:type="dxa" w:w="60"/>
+              <w:left w:type="dxa" w:w="90"/>
+              <w:bottom w:type="dxa" w:w="60"/>
+              <w:right w:type="dxa" w:w="90"/>
+            </w:tcMar>
+          </w:tcPr>
+          <w:p>
+            <w:pPr>
+              <w:bidi w:val="false"/>
+            </w:pPr>
+            <w:r>
+              <w:rPr>
+                <w:sz w:val="18"/>
+                <w:szCs w:val="18"/>
+                <w:rtl w:val="false"/>
+              </w:rPr>
+              <w:t xml:space="preserve">Round 3 (implementation): replaced the easy distractors in Part A (P3, plan step 6), about 35 items, each with an explanation</w:t>
+            </w:r>
+          </w:p>
+        </w:tc>
+      </w:tr>
+      <w:tr>
+        <w:trPr>
+          <w:tblHeader w:val="off"/>
+        </w:trPr>
+        <w:tc>
+          <w:tcPr>
+            <w:tcW w:type="dxa" w:w="786"/>
+            <w:tcBorders>
+              <w:top w:val="single" w:color="BBBBBB" w:sz="4"/>
+              <w:left w:val="single" w:color="BBBBBB" w:sz="4"/>
+              <w:bottom w:val="single" w:color="BBBBBB" w:sz="4"/>
+              <w:right w:val="single" w:color="BBBBBB" w:sz="4"/>
+            </w:tcBorders>
+            <w:tcMar>
+              <w:top w:type="dxa" w:w="60"/>
+              <w:left w:type="dxa" w:w="90"/>
+              <w:bottom w:type="dxa" w:w="60"/>
+              <w:right w:type="dxa" w:w="90"/>
+            </w:tcMar>
+          </w:tcPr>
+          <w:p>
+            <w:pPr>
+              <w:bidi w:val="false"/>
+            </w:pPr>
+            <w:r>
+              <w:rPr>
+                <w:sz w:val="18"/>
+                <w:szCs w:val="18"/>
+                <w:rtl w:val="false"/>
+              </w:rPr>
+              <w:t xml:space="preserve">2026-09-28</w:t>
+            </w:r>
+          </w:p>
+        </w:tc>
+        <w:tc>
+          <w:tcPr>
+            <w:tcW w:type="dxa" w:w="786"/>
+            <w:tcBorders>
+              <w:top w:val="single" w:color="BBBBBB" w:sz="4"/>
+              <w:left w:val="single" w:color="BBBBBB" w:sz="4"/>
+              <w:bottom w:val="single" w:color="BBBBBB" w:sz="4"/>
+              <w:right w:val="single" w:color="BBBBBB" w:sz="4"/>
+            </w:tcBorders>
+            <w:tcMar>
+              <w:top w:type="dxa" w:w="60"/>
+              <w:left w:type="dxa" w:w="90"/>
+              <w:bottom w:type="dxa" w:w="60"/>
+              <w:right w:type="dxa" w:w="90"/>
+            </w:tcMar>
+          </w:tcPr>
+          <w:p>
+            <w:pPr>
+              <w:bidi w:val="false"/>
+            </w:pPr>
+            <w:r>
+              <w:rPr>
+                <w:sz w:val="18"/>
+                <w:szCs w:val="18"/>
+                <w:rtl w:val="false"/>
+              </w:rPr>
+              <w:t xml:space="preserve">Claude</w:t>
+            </w:r>
+          </w:p>
+        </w:tc>
+        <w:tc>
+          <w:tcPr>
+            <w:tcW w:type="dxa" w:w="7788"/>
+            <w:tcBorders>
+              <w:top w:val="single" w:color="BBBBBB" w:sz="4"/>
+              <w:left w:val="single" w:color="BBBBBB" w:sz="4"/>
+              <w:bottom w:val="single" w:color="BBBBBB" w:sz="4"/>
+              <w:right w:val="single" w:color="BBBBBB" w:sz="4"/>
+            </w:tcBorders>
+            <w:tcMar>
+              <w:top w:type="dxa" w:w="60"/>
+              <w:left w:type="dxa" w:w="90"/>
+              <w:bottom w:type="dxa" w:w="60"/>
+              <w:right w:type="dxa" w:w="90"/>
+            </w:tcMar>
+          </w:tcPr>
+          <w:p>
+            <w:pPr>
+              <w:bidi w:val="false"/>
+            </w:pPr>
+            <w:r>
+              <w:rPr>
+                <w:sz w:val="18"/>
+                <w:szCs w:val="18"/>
+                <w:rtl w:val="false"/>
+              </w:rPr>
+              <w:t xml:space="preserve">Round 3 (implementation): P5 spelling. Added 48 listen-mode spelling screens with a Hebrew hint (a new optional </w:t>
+            </w:r>
+            <w:r>
+              <w:rPr>
+                <w:rFonts w:ascii="Consolas" w:cs="Consolas" w:eastAsia="Consolas" w:hAnsi="Consolas"/>
+                <w:sz w:val="19"/>
+                <w:szCs w:val="19"/>
+                <w:rtl w:val="false"/>
+              </w:rPr>
+              <w:t xml:space="preserve">hintHe</w:t>
+            </w:r>
+            <w:r>
+              <w:rPr>
+                <w:sz w:val="18"/>
+                <w:szCs w:val="18"/>
+                <w:rtl w:val="false"/>
+              </w:rPr>
+              <w:t xml:space="preserve"> field). Listen falls back to copy mode without browser speech. Copy mode is kept. Covers the spelling half of plan step 11</w:t>
+            </w:r>
+          </w:p>
+        </w:tc>
+      </w:tr>
+      <w:tr>
+        <w:trPr>
+          <w:tblHeader w:val="off"/>
+        </w:trPr>
+        <w:tc>
+          <w:tcPr>
+            <w:tcW w:type="dxa" w:w="786"/>
+            <w:tcBorders>
+              <w:top w:val="single" w:color="BBBBBB" w:sz="4"/>
+              <w:left w:val="single" w:color="BBBBBB" w:sz="4"/>
+              <w:bottom w:val="single" w:color="BBBBBB" w:sz="4"/>
+              <w:right w:val="single" w:color="BBBBBB" w:sz="4"/>
+            </w:tcBorders>
+            <w:tcMar>
+              <w:top w:type="dxa" w:w="60"/>
+              <w:left w:type="dxa" w:w="90"/>
+              <w:bottom w:type="dxa" w:w="60"/>
+              <w:right w:type="dxa" w:w="90"/>
+            </w:tcMar>
+          </w:tcPr>
+          <w:p>
+            <w:pPr>
+              <w:bidi w:val="false"/>
+            </w:pPr>
+            <w:r>
+              <w:rPr>
+                <w:sz w:val="18"/>
+                <w:szCs w:val="18"/>
+                <w:rtl w:val="false"/>
+              </w:rPr>
+              <w:t xml:space="preserve">2026-09-28</w:t>
+            </w:r>
+          </w:p>
+        </w:tc>
+        <w:tc>
+          <w:tcPr>
+            <w:tcW w:type="dxa" w:w="786"/>
+            <w:tcBorders>
+              <w:top w:val="single" w:color="BBBBBB" w:sz="4"/>
+              <w:left w:val="single" w:color="BBBBBB" w:sz="4"/>
+              <w:bottom w:val="single" w:color="BBBBBB" w:sz="4"/>
+              <w:right w:val="single" w:color="BBBBBB" w:sz="4"/>
+            </w:tcBorders>
+            <w:tcMar>
+              <w:top w:type="dxa" w:w="60"/>
+              <w:left w:type="dxa" w:w="90"/>
+              <w:bottom w:type="dxa" w:w="60"/>
+              <w:right w:type="dxa" w:w="90"/>
+            </w:tcMar>
+          </w:tcPr>
+          <w:p>
+            <w:pPr>
+              <w:bidi w:val="false"/>
+            </w:pPr>
+            <w:r>
+              <w:rPr>
+                <w:sz w:val="18"/>
+                <w:szCs w:val="18"/>
+                <w:rtl w:val="false"/>
+              </w:rPr>
+              <w:t xml:space="preserve">Claude</w:t>
+            </w:r>
+          </w:p>
+        </w:tc>
+        <w:tc>
+          <w:tcPr>
+            <w:tcW w:type="dxa" w:w="7788"/>
+            <w:tcBorders>
+              <w:top w:val="single" w:color="BBBBBB" w:sz="4"/>
+              <w:left w:val="single" w:color="BBBBBB" w:sz="4"/>
+              <w:bottom w:val="single" w:color="BBBBBB" w:sz="4"/>
+              <w:right w:val="single" w:color="BBBBBB" w:sz="4"/>
+            </w:tcBorders>
+            <w:tcMar>
+              <w:top w:type="dxa" w:w="60"/>
+              <w:left w:type="dxa" w:w="90"/>
+              <w:bottom w:type="dxa" w:w="60"/>
+              <w:right w:type="dxa" w:w="90"/>
+            </w:tcMar>
+          </w:tcPr>
+          <w:p>
+            <w:pPr>
+              <w:bidi w:val="false"/>
+            </w:pPr>
+            <w:r>
+              <w:rPr>
+                <w:sz w:val="18"/>
+                <w:szCs w:val="18"/>
+                <w:rtl w:val="false"/>
+              </w:rPr>
+              <w:t xml:space="preserve">Round 4 (implementation): owner ruled P7 not an issue (teacher-sourced claims, step 3 closed). P8 fixed as a parallel track (step 5). P9 polish (step 4), plus the broken l03 self-check. Also scored </w:t>
+            </w:r>
+            <w:r>
+              <w:rPr>
+                <w:i/>
+                <w:iCs/>
+                <w:sz w:val="18"/>
+                <w:szCs w:val="18"/>
+                <w:rtl w:val="false"/>
+              </w:rPr>
+              <w:t xml:space="preserve">but</w:t>
+            </w:r>
+            <w:r>
+              <w:rPr>
+                <w:sz w:val="18"/>
+                <w:szCs w:val="18"/>
+                <w:rtl w:val="false"/>
+              </w:rPr>
+              <w:t xml:space="preserve"> in l08's exam round (a second copy of a P1 bug)</w:t>
+            </w:r>
+          </w:p>
+        </w:tc>
+      </w:tr>
+      <w:tr>
+        <w:trPr>
+          <w:tblHeader w:val="off"/>
+        </w:trPr>
+        <w:tc>
+          <w:tcPr>
+            <w:tcW w:type="dxa" w:w="786"/>
+            <w:tcBorders>
+              <w:top w:val="single" w:color="BBBBBB" w:sz="4"/>
+              <w:left w:val="single" w:color="BBBBBB" w:sz="4"/>
+              <w:bottom w:val="single" w:color="BBBBBB" w:sz="4"/>
+              <w:right w:val="single" w:color="BBBBBB" w:sz="4"/>
+            </w:tcBorders>
+            <w:tcMar>
+              <w:top w:type="dxa" w:w="60"/>
+              <w:left w:type="dxa" w:w="90"/>
+              <w:bottom w:type="dxa" w:w="60"/>
+              <w:right w:type="dxa" w:w="90"/>
+            </w:tcMar>
+          </w:tcPr>
+          <w:p>
+            <w:pPr>
+              <w:bidi w:val="false"/>
+            </w:pPr>
+            <w:r>
+              <w:rPr>
+                <w:sz w:val="18"/>
+                <w:szCs w:val="18"/>
+                <w:rtl w:val="false"/>
+              </w:rPr>
+              <w:t xml:space="preserve">2026-09-28</w:t>
+            </w:r>
+          </w:p>
+        </w:tc>
+        <w:tc>
+          <w:tcPr>
+            <w:tcW w:type="dxa" w:w="786"/>
+            <w:tcBorders>
+              <w:top w:val="single" w:color="BBBBBB" w:sz="4"/>
+              <w:left w:val="single" w:color="BBBBBB" w:sz="4"/>
+              <w:bottom w:val="single" w:color="BBBBBB" w:sz="4"/>
+              <w:right w:val="single" w:color="BBBBBB" w:sz="4"/>
+            </w:tcBorders>
+            <w:tcMar>
+              <w:top w:type="dxa" w:w="60"/>
+              <w:left w:type="dxa" w:w="90"/>
+              <w:bottom w:type="dxa" w:w="60"/>
+              <w:right w:type="dxa" w:w="90"/>
+            </w:tcMar>
+          </w:tcPr>
+          <w:p>
+            <w:pPr>
+              <w:bidi w:val="false"/>
+            </w:pPr>
+            <w:r>
+              <w:rPr>
+                <w:sz w:val="18"/>
+                <w:szCs w:val="18"/>
+                <w:rtl w:val="false"/>
+              </w:rPr>
+              <w:t xml:space="preserve">Claude</w:t>
+            </w:r>
+          </w:p>
+        </w:tc>
+        <w:tc>
+          <w:tcPr>
+            <w:tcW w:type="dxa" w:w="7788"/>
+            <w:tcBorders>
+              <w:top w:val="single" w:color="BBBBBB" w:sz="4"/>
+              <w:left w:val="single" w:color="BBBBBB" w:sz="4"/>
+              <w:bottom w:val="single" w:color="BBBBBB" w:sz="4"/>
+              <w:right w:val="single" w:color="BBBBBB" w:sz="4"/>
+            </w:tcBorders>
+            <w:tcMar>
+              <w:top w:type="dxa" w:w="60"/>
+              <w:left w:type="dxa" w:w="90"/>
+              <w:bottom w:type="dxa" w:w="60"/>
+              <w:right w:type="dxa" w:w="90"/>
+            </w:tcMar>
+          </w:tcPr>
+          <w:p>
+            <w:pPr>
+              <w:bidi w:val="false"/>
+            </w:pPr>
+            <w:r>
+              <w:rPr>
+                <w:sz w:val="18"/>
+                <w:szCs w:val="18"/>
+                <w:rtl w:val="false"/>
+              </w:rPr>
+              <w:t xml:space="preserve">Round 4: P6 prototype on l06 + not-q (filler round cut, required fresh-text exam round, real NOT question at the end of the l06 drill)</w:t>
+            </w:r>
+          </w:p>
+        </w:tc>
+      </w:tr>
+      <w:tr>
+        <w:trPr>
+          <w:tblHeader w:val="off"/>
+        </w:trPr>
+        <w:tc>
+          <w:tcPr>
+            <w:tcW w:type="dxa" w:w="786"/>
+            <w:tcBorders>
+              <w:top w:val="single" w:color="BBBBBB" w:sz="4"/>
+              <w:left w:val="single" w:color="BBBBBB" w:sz="4"/>
+              <w:bottom w:val="single" w:color="BBBBBB" w:sz="4"/>
+              <w:right w:val="single" w:color="BBBBBB" w:sz="4"/>
+            </w:tcBorders>
+            <w:tcMar>
+              <w:top w:type="dxa" w:w="60"/>
+              <w:left w:type="dxa" w:w="90"/>
+              <w:bottom w:type="dxa" w:w="60"/>
+              <w:right w:type="dxa" w:w="90"/>
+            </w:tcMar>
+          </w:tcPr>
+          <w:p>
+            <w:pPr>
+              <w:bidi w:val="false"/>
+            </w:pPr>
+            <w:r>
+              <w:rPr>
+                <w:sz w:val="18"/>
+                <w:szCs w:val="18"/>
+                <w:rtl w:val="false"/>
+              </w:rPr>
+              <w:t xml:space="preserve">2026-09-28</w:t>
+            </w:r>
+          </w:p>
+        </w:tc>
+        <w:tc>
+          <w:tcPr>
+            <w:tcW w:type="dxa" w:w="786"/>
+            <w:tcBorders>
+              <w:top w:val="single" w:color="BBBBBB" w:sz="4"/>
+              <w:left w:val="single" w:color="BBBBBB" w:sz="4"/>
+              <w:bottom w:val="single" w:color="BBBBBB" w:sz="4"/>
+              <w:right w:val="single" w:color="BBBBBB" w:sz="4"/>
+            </w:tcBorders>
+            <w:tcMar>
+              <w:top w:type="dxa" w:w="60"/>
+              <w:left w:type="dxa" w:w="90"/>
+              <w:bottom w:type="dxa" w:w="60"/>
+              <w:right w:type="dxa" w:w="90"/>
+            </w:tcMar>
+          </w:tcPr>
+          <w:p>
+            <w:pPr>
+              <w:bidi w:val="false"/>
+            </w:pPr>
+            <w:r>
+              <w:rPr>
+                <w:sz w:val="18"/>
+                <w:szCs w:val="18"/>
+                <w:rtl w:val="false"/>
+              </w:rPr>
+              <w:t xml:space="preserve">Claude</w:t>
+            </w:r>
+          </w:p>
+        </w:tc>
+        <w:tc>
+          <w:tcPr>
+            <w:tcW w:type="dxa" w:w="7788"/>
+            <w:tcBorders>
+              <w:top w:val="single" w:color="BBBBBB" w:sz="4"/>
+              <w:left w:val="single" w:color="BBBBBB" w:sz="4"/>
+              <w:bottom w:val="single" w:color="BBBBBB" w:sz="4"/>
+              <w:right w:val="single" w:color="BBBBBB" w:sz="4"/>
+            </w:tcBorders>
+            <w:tcMar>
+              <w:top w:type="dxa" w:w="60"/>
+              <w:left w:type="dxa" w:w="90"/>
+              <w:bottom w:type="dxa" w:w="60"/>
+              <w:right w:type="dxa" w:w="90"/>
+            </w:tcMar>
+          </w:tcPr>
+          <w:p>
+            <w:pPr>
+              <w:bidi w:val="false"/>
+            </w:pPr>
+            <w:r>
+              <w:rPr>
+                <w:sz w:val="18"/>
+                <w:szCs w:val="18"/>
+                <w:rtl w:val="false"/>
+              </w:rPr>
+              <w:t xml:space="preserve">Round 5: P6 pattern fixed after owner review (not-q requiredRounds 3; the l06 long text in its own last round) and written into lesson-structure.md. Rollout pair 1: l08 + n-b46b7e2b. Also fixes P2 for however (the rule is now a clue, with questions answered before however/but)</w:t>
+            </w:r>
+          </w:p>
+        </w:tc>
+      </w:tr>
+      <w:tr>
+        <w:trPr>
+          <w:tblHeader w:val="off"/>
+        </w:trPr>
+        <w:tc>
+          <w:tcPr>
+            <w:tcW w:type="dxa" w:w="786"/>
+            <w:tcBorders>
+              <w:top w:val="single" w:color="BBBBBB" w:sz="4"/>
+              <w:left w:val="single" w:color="BBBBBB" w:sz="4"/>
+              <w:bottom w:val="single" w:color="BBBBBB" w:sz="4"/>
+              <w:right w:val="single" w:color="BBBBBB" w:sz="4"/>
+            </w:tcBorders>
+            <w:tcMar>
+              <w:top w:type="dxa" w:w="60"/>
+              <w:left w:type="dxa" w:w="90"/>
+              <w:bottom w:type="dxa" w:w="60"/>
+              <w:right w:type="dxa" w:w="90"/>
+            </w:tcMar>
+          </w:tcPr>
+          <w:p>
+            <w:pPr>
+              <w:bidi w:val="false"/>
+            </w:pPr>
+            <w:r>
+              <w:rPr>
+                <w:sz w:val="18"/>
+                <w:szCs w:val="18"/>
+                <w:rtl w:val="false"/>
+              </w:rPr>
+              <w:t xml:space="preserve">2026-09-28</w:t>
+            </w:r>
+          </w:p>
+        </w:tc>
+        <w:tc>
+          <w:tcPr>
+            <w:tcW w:type="dxa" w:w="786"/>
+            <w:tcBorders>
+              <w:top w:val="single" w:color="BBBBBB" w:sz="4"/>
+              <w:left w:val="single" w:color="BBBBBB" w:sz="4"/>
+              <w:bottom w:val="single" w:color="BBBBBB" w:sz="4"/>
+              <w:right w:val="single" w:color="BBBBBB" w:sz="4"/>
+            </w:tcBorders>
+            <w:tcMar>
+              <w:top w:type="dxa" w:w="60"/>
+              <w:left w:type="dxa" w:w="90"/>
+              <w:bottom w:type="dxa" w:w="60"/>
+              <w:right w:type="dxa" w:w="90"/>
+            </w:tcMar>
+          </w:tcPr>
+          <w:p>
+            <w:pPr>
+              <w:bidi w:val="false"/>
+            </w:pPr>
+            <w:r>
+              <w:rPr>
+                <w:sz w:val="18"/>
+                <w:szCs w:val="18"/>
+                <w:rtl w:val="false"/>
+              </w:rPr>
+              <w:t xml:space="preserve">Claude</w:t>
+            </w:r>
+          </w:p>
+        </w:tc>
+        <w:tc>
+          <w:tcPr>
+            <w:tcW w:type="dxa" w:w="7788"/>
+            <w:tcBorders>
+              <w:top w:val="single" w:color="BBBBBB" w:sz="4"/>
+              <w:left w:val="single" w:color="BBBBBB" w:sz="4"/>
+              <w:bottom w:val="single" w:color="BBBBBB" w:sz="4"/>
+              <w:right w:val="single" w:color="BBBBBB" w:sz="4"/>
+            </w:tcBorders>
+            <w:tcMar>
+              <w:top w:type="dxa" w:w="60"/>
+              <w:left w:type="dxa" w:w="90"/>
+              <w:bottom w:type="dxa" w:w="60"/>
+              <w:right w:type="dxa" w:w="90"/>
+            </w:tcMar>
+          </w:tcPr>
+          <w:p>
+            <w:pPr>
+              <w:bidi w:val="false"/>
+            </w:pPr>
+            <w:r>
+              <w:rPr>
+                <w:sz w:val="18"/>
+                <w:szCs w:val="18"/>
+                <w:rtl w:val="false"/>
+              </w:rPr>
+              <w:t xml:space="preserve">Added section 11 (implementation status): step-by-step progress with commits, the owner decisions made during implementation, where to resume, and known side effects</w:t>
+            </w:r>
+          </w:p>
+        </w:tc>
+      </w:tr>
     </w:tbl>
     <w:p>
       <w:pPr>
@@ -15036,6 +15973,2655 @@
           <w:rtl w:val="false"/>
         </w:rPr>
         <w:t xml:space="preserve"> turned into a decision table with each reviewer's position.</w:t>
+      </w:r>
+    </w:p>
+    <w:p>
+      <w:pPr>
+        <w:pStyle w:val="Heading1"/>
+        <w:pageBreakBefore/>
+      </w:pPr>
+      <w:r>
+        <w:rPr>
+          <w:rtl w:val="false"/>
+        </w:rPr>
+        <w:t xml:space="preserve">11. Implementation status</w:t>
+      </w:r>
+    </w:p>
+    <w:p>
+      <w:pPr>
+        <w:bidi w:val="false"/>
+        <w:spacing w:after="100"/>
+      </w:pPr>
+      <w:r>
+        <w:rPr>
+          <w:rtl w:val="false"/>
+        </w:rPr>
+        <w:t xml:space="preserve">Snapshot: 2026-09-28, commit 585865e. Scope: Parts A and B. Every content change is also logged in </w:t>
+      </w:r>
+      <w:r>
+        <w:rPr>
+          <w:rFonts w:ascii="Consolas" w:cs="Consolas" w:eastAsia="Consolas" w:hAnsi="Consolas"/>
+          <w:sz w:val="19"/>
+          <w:szCs w:val="19"/>
+          <w:rtl w:val="false"/>
+        </w:rPr>
+        <w:t xml:space="preserve">docs/module-c-audit.md</w:t>
+      </w:r>
+      <w:r>
+        <w:rPr>
+          <w:rtl w:val="false"/>
+        </w:rPr>
+        <w:t xml:space="preserve">.</w:t>
+      </w:r>
+    </w:p>
+    <w:p>
+      <w:pPr>
+        <w:bidi w:val="false"/>
+        <w:spacing w:after="100"/>
+      </w:pPr>
+      <w:r>
+        <w:rPr>
+          <w:b/>
+          <w:bCs/>
+          <w:rtl w:val="false"/>
+        </w:rPr>
+        <w:t xml:space="preserve">Grades in sections 1, 3 and 6 are still the pre-fix audit grades.</w:t>
+      </w:r>
+      <w:r>
+        <w:rPr>
+          <w:rtl w:val="false"/>
+        </w:rPr>
+        <w:t xml:space="preserve"> Re-grade after Phase 1-2 are closed and the changed lessons have been played.</w:t>
+      </w:r>
+    </w:p>
+    <w:p>
+      <w:pPr>
+        <w:pStyle w:val="Heading2"/>
+      </w:pPr>
+      <w:r>
+        <w:rPr>
+          <w:rtl w:val="false"/>
+        </w:rPr>
+        <w:t xml:space="preserve">Plan steps</w:t>
+      </w:r>
+    </w:p>
+    <w:tbl>
+      <w:tblPr>
+        <w:bidiVisual w:val="0"/>
+        <w:tblW w:type="dxa" w:w="9360"/>
+        <w:tblBorders>
+          <w:top w:val="single" w:color="auto" w:sz="4"/>
+          <w:left w:val="single" w:color="auto" w:sz="4"/>
+          <w:bottom w:val="single" w:color="auto" w:sz="4"/>
+          <w:right w:val="single" w:color="auto" w:sz="4"/>
+          <w:insideH w:val="single" w:color="auto" w:sz="4"/>
+          <w:insideV w:val="single" w:color="auto" w:sz="4"/>
+        </w:tblBorders>
+      </w:tblPr>
+      <w:tblGrid>
+        <w:gridCol w:w="833"/>
+        <w:gridCol w:w="1146"/>
+        <w:gridCol w:w="6236"/>
+        <w:gridCol w:w="1145"/>
+      </w:tblGrid>
+      <w:tr>
+        <w:trPr>
+          <w:tblHeader/>
+        </w:trPr>
+        <w:tc>
+          <w:tcPr>
+            <w:tcW w:type="dxa" w:w="833"/>
+            <w:tcBorders>
+              <w:top w:val="single" w:color="BBBBBB" w:sz="4"/>
+              <w:left w:val="single" w:color="BBBBBB" w:sz="4"/>
+              <w:bottom w:val="single" w:color="BBBBBB" w:sz="4"/>
+              <w:right w:val="single" w:color="BBBBBB" w:sz="4"/>
+            </w:tcBorders>
+            <w:shd w:fill="E8EEF6" w:color="auto" w:val="clear"/>
+            <w:tcMar>
+              <w:top w:type="dxa" w:w="60"/>
+              <w:left w:type="dxa" w:w="90"/>
+              <w:bottom w:type="dxa" w:w="60"/>
+              <w:right w:type="dxa" w:w="90"/>
+            </w:tcMar>
+          </w:tcPr>
+          <w:p>
+            <w:pPr>
+              <w:bidi w:val="false"/>
+            </w:pPr>
+            <w:r>
+              <w:rPr>
+                <w:b/>
+                <w:bCs/>
+                <w:sz w:val="18"/>
+                <w:szCs w:val="18"/>
+                <w:rtl w:val="false"/>
+              </w:rPr>
+              <w:t xml:space="preserve">Step</w:t>
+            </w:r>
+          </w:p>
+        </w:tc>
+        <w:tc>
+          <w:tcPr>
+            <w:tcW w:type="dxa" w:w="1146"/>
+            <w:tcBorders>
+              <w:top w:val="single" w:color="BBBBBB" w:sz="4"/>
+              <w:left w:val="single" w:color="BBBBBB" w:sz="4"/>
+              <w:bottom w:val="single" w:color="BBBBBB" w:sz="4"/>
+              <w:right w:val="single" w:color="BBBBBB" w:sz="4"/>
+            </w:tcBorders>
+            <w:shd w:fill="E8EEF6" w:color="auto" w:val="clear"/>
+            <w:tcMar>
+              <w:top w:type="dxa" w:w="60"/>
+              <w:left w:type="dxa" w:w="90"/>
+              <w:bottom w:type="dxa" w:w="60"/>
+              <w:right w:type="dxa" w:w="90"/>
+            </w:tcMar>
+          </w:tcPr>
+          <w:p>
+            <w:pPr>
+              <w:bidi w:val="false"/>
+            </w:pPr>
+            <w:r>
+              <w:rPr>
+                <w:b/>
+                <w:bCs/>
+                <w:sz w:val="18"/>
+                <w:szCs w:val="18"/>
+                <w:rtl w:val="false"/>
+              </w:rPr>
+              <w:t xml:space="preserve">Issue</w:t>
+            </w:r>
+          </w:p>
+        </w:tc>
+        <w:tc>
+          <w:tcPr>
+            <w:tcW w:type="dxa" w:w="6236"/>
+            <w:tcBorders>
+              <w:top w:val="single" w:color="BBBBBB" w:sz="4"/>
+              <w:left w:val="single" w:color="BBBBBB" w:sz="4"/>
+              <w:bottom w:val="single" w:color="BBBBBB" w:sz="4"/>
+              <w:right w:val="single" w:color="BBBBBB" w:sz="4"/>
+            </w:tcBorders>
+            <w:shd w:fill="E8EEF6" w:color="auto" w:val="clear"/>
+            <w:tcMar>
+              <w:top w:type="dxa" w:w="60"/>
+              <w:left w:type="dxa" w:w="90"/>
+              <w:bottom w:type="dxa" w:w="60"/>
+              <w:right w:type="dxa" w:w="90"/>
+            </w:tcMar>
+          </w:tcPr>
+          <w:p>
+            <w:pPr>
+              <w:bidi w:val="false"/>
+            </w:pPr>
+            <w:r>
+              <w:rPr>
+                <w:b/>
+                <w:bCs/>
+                <w:sz w:val="18"/>
+                <w:szCs w:val="18"/>
+                <w:rtl w:val="false"/>
+              </w:rPr>
+              <w:t xml:space="preserve">Status</w:t>
+            </w:r>
+          </w:p>
+        </w:tc>
+        <w:tc>
+          <w:tcPr>
+            <w:tcW w:type="dxa" w:w="1145"/>
+            <w:tcBorders>
+              <w:top w:val="single" w:color="BBBBBB" w:sz="4"/>
+              <w:left w:val="single" w:color="BBBBBB" w:sz="4"/>
+              <w:bottom w:val="single" w:color="BBBBBB" w:sz="4"/>
+              <w:right w:val="single" w:color="BBBBBB" w:sz="4"/>
+            </w:tcBorders>
+            <w:shd w:fill="E8EEF6" w:color="auto" w:val="clear"/>
+            <w:tcMar>
+              <w:top w:type="dxa" w:w="60"/>
+              <w:left w:type="dxa" w:w="90"/>
+              <w:bottom w:type="dxa" w:w="60"/>
+              <w:right w:type="dxa" w:w="90"/>
+            </w:tcMar>
+          </w:tcPr>
+          <w:p>
+            <w:pPr>
+              <w:bidi w:val="false"/>
+            </w:pPr>
+            <w:r>
+              <w:rPr>
+                <w:b/>
+                <w:bCs/>
+                <w:sz w:val="18"/>
+                <w:szCs w:val="18"/>
+                <w:rtl w:val="false"/>
+              </w:rPr>
+              <w:t xml:space="preserve">Commits</w:t>
+            </w:r>
+          </w:p>
+        </w:tc>
+      </w:tr>
+      <w:tr>
+        <w:trPr>
+          <w:tblHeader w:val="off"/>
+        </w:trPr>
+        <w:tc>
+          <w:tcPr>
+            <w:tcW w:type="dxa" w:w="833"/>
+            <w:tcBorders>
+              <w:top w:val="single" w:color="BBBBBB" w:sz="4"/>
+              <w:left w:val="single" w:color="BBBBBB" w:sz="4"/>
+              <w:bottom w:val="single" w:color="BBBBBB" w:sz="4"/>
+              <w:right w:val="single" w:color="BBBBBB" w:sz="4"/>
+            </w:tcBorders>
+            <w:tcMar>
+              <w:top w:type="dxa" w:w="60"/>
+              <w:left w:type="dxa" w:w="90"/>
+              <w:bottom w:type="dxa" w:w="60"/>
+              <w:right w:type="dxa" w:w="90"/>
+            </w:tcMar>
+          </w:tcPr>
+          <w:p>
+            <w:pPr>
+              <w:bidi w:val="false"/>
+            </w:pPr>
+            <w:r>
+              <w:rPr>
+                <w:sz w:val="18"/>
+                <w:szCs w:val="18"/>
+                <w:rtl w:val="false"/>
+              </w:rPr>
+              <w:t xml:space="preserve">1</w:t>
+            </w:r>
+          </w:p>
+        </w:tc>
+        <w:tc>
+          <w:tcPr>
+            <w:tcW w:type="dxa" w:w="1146"/>
+            <w:tcBorders>
+              <w:top w:val="single" w:color="BBBBBB" w:sz="4"/>
+              <w:left w:val="single" w:color="BBBBBB" w:sz="4"/>
+              <w:bottom w:val="single" w:color="BBBBBB" w:sz="4"/>
+              <w:right w:val="single" w:color="BBBBBB" w:sz="4"/>
+            </w:tcBorders>
+            <w:tcMar>
+              <w:top w:type="dxa" w:w="60"/>
+              <w:left w:type="dxa" w:w="90"/>
+              <w:bottom w:type="dxa" w:w="60"/>
+              <w:right w:type="dxa" w:w="90"/>
+            </w:tcMar>
+          </w:tcPr>
+          <w:p>
+            <w:pPr>
+              <w:bidi w:val="false"/>
+            </w:pPr>
+            <w:r>
+              <w:rPr>
+                <w:sz w:val="18"/>
+                <w:szCs w:val="18"/>
+                <w:rtl w:val="false"/>
+              </w:rPr>
+              <w:t xml:space="preserve">P1 wrong / ambiguous items</w:t>
+            </w:r>
+          </w:p>
+        </w:tc>
+        <w:tc>
+          <w:tcPr>
+            <w:tcW w:type="dxa" w:w="6236"/>
+            <w:tcBorders>
+              <w:top w:val="single" w:color="BBBBBB" w:sz="4"/>
+              <w:left w:val="single" w:color="BBBBBB" w:sz="4"/>
+              <w:bottom w:val="single" w:color="BBBBBB" w:sz="4"/>
+              <w:right w:val="single" w:color="BBBBBB" w:sz="4"/>
+            </w:tcBorders>
+            <w:tcMar>
+              <w:top w:type="dxa" w:w="60"/>
+              <w:left w:type="dxa" w:w="90"/>
+              <w:bottom w:type="dxa" w:w="60"/>
+              <w:right w:type="dxa" w:w="90"/>
+            </w:tcMar>
+          </w:tcPr>
+          <w:p>
+            <w:pPr>
+              <w:bidi w:val="false"/>
+            </w:pPr>
+            <w:r>
+              <w:rPr>
+                <w:b/>
+                <w:bCs/>
+                <w:sz w:val="18"/>
+                <w:szCs w:val="18"/>
+                <w:rtl w:val="false"/>
+              </w:rPr>
+              <w:t xml:space="preserve">Done.</w:t>
+            </w:r>
+            <w:r>
+              <w:rPr>
+                <w:sz w:val="18"/>
+                <w:szCs w:val="18"/>
+                <w:rtl w:val="false"/>
+              </w:rPr>
+              <w:t xml:space="preserve"> All 11 fixed. Found while mapping screens: a second unscored </w:t>
+            </w:r>
+            <w:r>
+              <w:rPr>
+                <w:i/>
+                <w:iCs/>
+                <w:sz w:val="18"/>
+                <w:szCs w:val="18"/>
+                <w:rtl w:val="false"/>
+              </w:rPr>
+              <w:t xml:space="preserve">but</w:t>
+            </w:r>
+            <w:r>
+              <w:rPr>
+                <w:sz w:val="18"/>
+                <w:szCs w:val="18"/>
+                <w:rtl w:val="false"/>
+              </w:rPr>
+              <w:t xml:space="preserve"> in l08's exam round (fixed), and the l03 round 5 self-check about Dr. Klein on a Dr. Diallo text (rewritten)</w:t>
+            </w:r>
+          </w:p>
+        </w:tc>
+        <w:tc>
+          <w:tcPr>
+            <w:tcW w:type="dxa" w:w="1145"/>
+            <w:tcBorders>
+              <w:top w:val="single" w:color="BBBBBB" w:sz="4"/>
+              <w:left w:val="single" w:color="BBBBBB" w:sz="4"/>
+              <w:bottom w:val="single" w:color="BBBBBB" w:sz="4"/>
+              <w:right w:val="single" w:color="BBBBBB" w:sz="4"/>
+            </w:tcBorders>
+            <w:tcMar>
+              <w:top w:type="dxa" w:w="60"/>
+              <w:left w:type="dxa" w:w="90"/>
+              <w:bottom w:type="dxa" w:w="60"/>
+              <w:right w:type="dxa" w:w="90"/>
+            </w:tcMar>
+          </w:tcPr>
+          <w:p>
+            <w:pPr>
+              <w:bidi w:val="false"/>
+            </w:pPr>
+            <w:r>
+              <w:rPr>
+                <w:sz w:val="18"/>
+                <w:szCs w:val="18"/>
+                <w:rtl w:val="false"/>
+              </w:rPr>
+              <w:t xml:space="preserve">b0974fe, cc5f92d, 4127989</w:t>
+            </w:r>
+          </w:p>
+        </w:tc>
+      </w:tr>
+      <w:tr>
+        <w:trPr>
+          <w:tblHeader w:val="off"/>
+        </w:trPr>
+        <w:tc>
+          <w:tcPr>
+            <w:tcW w:type="dxa" w:w="833"/>
+            <w:tcBorders>
+              <w:top w:val="single" w:color="BBBBBB" w:sz="4"/>
+              <w:left w:val="single" w:color="BBBBBB" w:sz="4"/>
+              <w:bottom w:val="single" w:color="BBBBBB" w:sz="4"/>
+              <w:right w:val="single" w:color="BBBBBB" w:sz="4"/>
+            </w:tcBorders>
+            <w:tcMar>
+              <w:top w:type="dxa" w:w="60"/>
+              <w:left w:type="dxa" w:w="90"/>
+              <w:bottom w:type="dxa" w:w="60"/>
+              <w:right w:type="dxa" w:w="90"/>
+            </w:tcMar>
+          </w:tcPr>
+          <w:p>
+            <w:pPr>
+              <w:bidi w:val="false"/>
+            </w:pPr>
+            <w:r>
+              <w:rPr>
+                <w:sz w:val="18"/>
+                <w:szCs w:val="18"/>
+                <w:rtl w:val="false"/>
+              </w:rPr>
+              <w:t xml:space="preserve">2</w:t>
+            </w:r>
+          </w:p>
+        </w:tc>
+        <w:tc>
+          <w:tcPr>
+            <w:tcW w:type="dxa" w:w="1146"/>
+            <w:tcBorders>
+              <w:top w:val="single" w:color="BBBBBB" w:sz="4"/>
+              <w:left w:val="single" w:color="BBBBBB" w:sz="4"/>
+              <w:bottom w:val="single" w:color="BBBBBB" w:sz="4"/>
+              <w:right w:val="single" w:color="BBBBBB" w:sz="4"/>
+            </w:tcBorders>
+            <w:tcMar>
+              <w:top w:type="dxa" w:w="60"/>
+              <w:left w:type="dxa" w:w="90"/>
+              <w:bottom w:type="dxa" w:w="60"/>
+              <w:right w:type="dxa" w:w="90"/>
+            </w:tcMar>
+          </w:tcPr>
+          <w:p>
+            <w:pPr>
+              <w:bidi w:val="false"/>
+            </w:pPr>
+            <w:r>
+              <w:rPr>
+                <w:sz w:val="18"/>
+                <w:szCs w:val="18"/>
+                <w:rtl w:val="false"/>
+              </w:rPr>
+              <w:t xml:space="preserve">P2 tips taught as laws</w:t>
+            </w:r>
+          </w:p>
+        </w:tc>
+        <w:tc>
+          <w:tcPr>
+            <w:tcW w:type="dxa" w:w="6236"/>
+            <w:tcBorders>
+              <w:top w:val="single" w:color="BBBBBB" w:sz="4"/>
+              <w:left w:val="single" w:color="BBBBBB" w:sz="4"/>
+              <w:bottom w:val="single" w:color="BBBBBB" w:sz="4"/>
+              <w:right w:val="single" w:color="BBBBBB" w:sz="4"/>
+            </w:tcBorders>
+            <w:tcMar>
+              <w:top w:type="dxa" w:w="60"/>
+              <w:left w:type="dxa" w:w="90"/>
+              <w:bottom w:type="dxa" w:w="60"/>
+              <w:right w:type="dxa" w:w="90"/>
+            </w:tcMar>
+          </w:tcPr>
+          <w:p>
+            <w:pPr>
+              <w:bidi w:val="false"/>
+            </w:pPr>
+            <w:r>
+              <w:rPr>
+                <w:b/>
+                <w:bCs/>
+                <w:sz w:val="18"/>
+                <w:szCs w:val="18"/>
+                <w:rtl w:val="false"/>
+              </w:rPr>
+              <w:t xml:space="preserve">Partly done.</w:t>
+            </w:r>
+            <w:r>
+              <w:rPr>
+                <w:sz w:val="18"/>
+                <w:szCs w:val="18"/>
+                <w:rtl w:val="false"/>
+              </w:rPr>
+              <w:t xml:space="preserve"> </w:t>
+            </w:r>
+            <w:r>
+              <w:rPr>
+                <w:i/>
+                <w:iCs/>
+                <w:sz w:val="18"/>
+                <w:szCs w:val="18"/>
+                <w:rtl w:val="false"/>
+              </w:rPr>
+              <w:t xml:space="preserve">however / but</w:t>
+            </w:r>
+            <w:r>
+              <w:rPr>
+                <w:sz w:val="18"/>
+                <w:szCs w:val="18"/>
+                <w:rtl w:val="false"/>
+              </w:rPr>
+              <w:t xml:space="preserve"> fixed in l08 + n-b46b7e2b. </w:t>
+            </w:r>
+            <w:r>
+              <w:rPr>
+                <w:i/>
+                <w:iCs/>
+                <w:sz w:val="18"/>
+                <w:szCs w:val="18"/>
+                <w:rtl w:val="false"/>
+              </w:rPr>
+              <w:t xml:space="preserve">most / only</w:t>
+            </w:r>
+            <w:r>
+              <w:rPr>
+                <w:sz w:val="18"/>
+                <w:szCs w:val="18"/>
+                <w:rtl w:val="false"/>
+              </w:rPr>
+              <w:t xml:space="preserve"> is still open and gets fixed with pair 2. The "I search, I don't read" summary line in l00 is still open</w:t>
+            </w:r>
+          </w:p>
+        </w:tc>
+        <w:tc>
+          <w:tcPr>
+            <w:tcW w:type="dxa" w:w="1145"/>
+            <w:tcBorders>
+              <w:top w:val="single" w:color="BBBBBB" w:sz="4"/>
+              <w:left w:val="single" w:color="BBBBBB" w:sz="4"/>
+              <w:bottom w:val="single" w:color="BBBBBB" w:sz="4"/>
+              <w:right w:val="single" w:color="BBBBBB" w:sz="4"/>
+            </w:tcBorders>
+            <w:tcMar>
+              <w:top w:type="dxa" w:w="60"/>
+              <w:left w:type="dxa" w:w="90"/>
+              <w:bottom w:type="dxa" w:w="60"/>
+              <w:right w:type="dxa" w:w="90"/>
+            </w:tcMar>
+          </w:tcPr>
+          <w:p>
+            <w:pPr>
+              <w:bidi w:val="false"/>
+            </w:pPr>
+            <w:r>
+              <w:rPr>
+                <w:sz w:val="18"/>
+                <w:szCs w:val="18"/>
+                <w:rtl w:val="false"/>
+              </w:rPr>
+              <w:t xml:space="preserve">585865e</w:t>
+            </w:r>
+          </w:p>
+        </w:tc>
+      </w:tr>
+      <w:tr>
+        <w:trPr>
+          <w:tblHeader w:val="off"/>
+        </w:trPr>
+        <w:tc>
+          <w:tcPr>
+            <w:tcW w:type="dxa" w:w="833"/>
+            <w:tcBorders>
+              <w:top w:val="single" w:color="BBBBBB" w:sz="4"/>
+              <w:left w:val="single" w:color="BBBBBB" w:sz="4"/>
+              <w:bottom w:val="single" w:color="BBBBBB" w:sz="4"/>
+              <w:right w:val="single" w:color="BBBBBB" w:sz="4"/>
+            </w:tcBorders>
+            <w:tcMar>
+              <w:top w:type="dxa" w:w="60"/>
+              <w:left w:type="dxa" w:w="90"/>
+              <w:bottom w:type="dxa" w:w="60"/>
+              <w:right w:type="dxa" w:w="90"/>
+            </w:tcMar>
+          </w:tcPr>
+          <w:p>
+            <w:pPr>
+              <w:bidi w:val="false"/>
+            </w:pPr>
+            <w:r>
+              <w:rPr>
+                <w:sz w:val="18"/>
+                <w:szCs w:val="18"/>
+                <w:rtl w:val="false"/>
+              </w:rPr>
+              <w:t xml:space="preserve">3</w:t>
+            </w:r>
+          </w:p>
+        </w:tc>
+        <w:tc>
+          <w:tcPr>
+            <w:tcW w:type="dxa" w:w="1146"/>
+            <w:tcBorders>
+              <w:top w:val="single" w:color="BBBBBB" w:sz="4"/>
+              <w:left w:val="single" w:color="BBBBBB" w:sz="4"/>
+              <w:bottom w:val="single" w:color="BBBBBB" w:sz="4"/>
+              <w:right w:val="single" w:color="BBBBBB" w:sz="4"/>
+            </w:tcBorders>
+            <w:tcMar>
+              <w:top w:type="dxa" w:w="60"/>
+              <w:left w:type="dxa" w:w="90"/>
+              <w:bottom w:type="dxa" w:w="60"/>
+              <w:right w:type="dxa" w:w="90"/>
+            </w:tcMar>
+          </w:tcPr>
+          <w:p>
+            <w:pPr>
+              <w:bidi w:val="false"/>
+            </w:pPr>
+            <w:r>
+              <w:rPr>
+                <w:sz w:val="18"/>
+                <w:szCs w:val="18"/>
+                <w:rtl w:val="false"/>
+              </w:rPr>
+              <w:t xml:space="preserve">P7 exact penalty numbers</w:t>
+            </w:r>
+          </w:p>
+        </w:tc>
+        <w:tc>
+          <w:tcPr>
+            <w:tcW w:type="dxa" w:w="6236"/>
+            <w:tcBorders>
+              <w:top w:val="single" w:color="BBBBBB" w:sz="4"/>
+              <w:left w:val="single" w:color="BBBBBB" w:sz="4"/>
+              <w:bottom w:val="single" w:color="BBBBBB" w:sz="4"/>
+              <w:right w:val="single" w:color="BBBBBB" w:sz="4"/>
+            </w:tcBorders>
+            <w:tcMar>
+              <w:top w:type="dxa" w:w="60"/>
+              <w:left w:type="dxa" w:w="90"/>
+              <w:bottom w:type="dxa" w:w="60"/>
+              <w:right w:type="dxa" w:w="90"/>
+            </w:tcMar>
+          </w:tcPr>
+          <w:p>
+            <w:pPr>
+              <w:bidi w:val="false"/>
+            </w:pPr>
+            <w:r>
+              <w:rPr>
+                <w:b/>
+                <w:bCs/>
+                <w:sz w:val="18"/>
+                <w:szCs w:val="18"/>
+                <w:rtl w:val="false"/>
+              </w:rPr>
+              <w:t xml:space="preserve">Closed, no change.</w:t>
+            </w:r>
+            <w:r>
+              <w:rPr>
+                <w:sz w:val="18"/>
+                <w:szCs w:val="18"/>
+                <w:rtl w:val="false"/>
+              </w:rPr>
+              <w:t xml:space="preserve"> Owner ruling: the claims come from a real English teacher</w:t>
+            </w:r>
+          </w:p>
+        </w:tc>
+        <w:tc>
+          <w:tcPr>
+            <w:tcW w:type="dxa" w:w="1145"/>
+            <w:tcBorders>
+              <w:top w:val="single" w:color="BBBBBB" w:sz="4"/>
+              <w:left w:val="single" w:color="BBBBBB" w:sz="4"/>
+              <w:bottom w:val="single" w:color="BBBBBB" w:sz="4"/>
+              <w:right w:val="single" w:color="BBBBBB" w:sz="4"/>
+            </w:tcBorders>
+            <w:tcMar>
+              <w:top w:type="dxa" w:w="60"/>
+              <w:left w:type="dxa" w:w="90"/>
+              <w:bottom w:type="dxa" w:w="60"/>
+              <w:right w:type="dxa" w:w="90"/>
+            </w:tcMar>
+          </w:tcPr>
+          <w:p>
+            <w:pPr>
+              <w:bidi w:val="false"/>
+            </w:pPr>
+            <w:r>
+              <w:rPr>
+                <w:sz w:val="18"/>
+                <w:szCs w:val="18"/>
+                <w:rtl w:val="false"/>
+              </w:rPr>
+              <w:t xml:space="preserve">-</w:t>
+            </w:r>
+          </w:p>
+        </w:tc>
+      </w:tr>
+      <w:tr>
+        <w:trPr>
+          <w:tblHeader w:val="off"/>
+        </w:trPr>
+        <w:tc>
+          <w:tcPr>
+            <w:tcW w:type="dxa" w:w="833"/>
+            <w:tcBorders>
+              <w:top w:val="single" w:color="BBBBBB" w:sz="4"/>
+              <w:left w:val="single" w:color="BBBBBB" w:sz="4"/>
+              <w:bottom w:val="single" w:color="BBBBBB" w:sz="4"/>
+              <w:right w:val="single" w:color="BBBBBB" w:sz="4"/>
+            </w:tcBorders>
+            <w:tcMar>
+              <w:top w:type="dxa" w:w="60"/>
+              <w:left w:type="dxa" w:w="90"/>
+              <w:bottom w:type="dxa" w:w="60"/>
+              <w:right w:type="dxa" w:w="90"/>
+            </w:tcMar>
+          </w:tcPr>
+          <w:p>
+            <w:pPr>
+              <w:bidi w:val="false"/>
+            </w:pPr>
+            <w:r>
+              <w:rPr>
+                <w:sz w:val="18"/>
+                <w:szCs w:val="18"/>
+                <w:rtl w:val="false"/>
+              </w:rPr>
+              <w:t xml:space="preserve">4</w:t>
+            </w:r>
+          </w:p>
+        </w:tc>
+        <w:tc>
+          <w:tcPr>
+            <w:tcW w:type="dxa" w:w="1146"/>
+            <w:tcBorders>
+              <w:top w:val="single" w:color="BBBBBB" w:sz="4"/>
+              <w:left w:val="single" w:color="BBBBBB" w:sz="4"/>
+              <w:bottom w:val="single" w:color="BBBBBB" w:sz="4"/>
+              <w:right w:val="single" w:color="BBBBBB" w:sz="4"/>
+            </w:tcBorders>
+            <w:tcMar>
+              <w:top w:type="dxa" w:w="60"/>
+              <w:left w:type="dxa" w:w="90"/>
+              <w:bottom w:type="dxa" w:w="60"/>
+              <w:right w:type="dxa" w:w="90"/>
+            </w:tcMar>
+          </w:tcPr>
+          <w:p>
+            <w:pPr>
+              <w:bidi w:val="false"/>
+            </w:pPr>
+            <w:r>
+              <w:rPr>
+                <w:sz w:val="18"/>
+                <w:szCs w:val="18"/>
+                <w:rtl w:val="false"/>
+              </w:rPr>
+              <w:t xml:space="preserve">P9 polish</w:t>
+            </w:r>
+          </w:p>
+        </w:tc>
+        <w:tc>
+          <w:tcPr>
+            <w:tcW w:type="dxa" w:w="6236"/>
+            <w:tcBorders>
+              <w:top w:val="single" w:color="BBBBBB" w:sz="4"/>
+              <w:left w:val="single" w:color="BBBBBB" w:sz="4"/>
+              <w:bottom w:val="single" w:color="BBBBBB" w:sz="4"/>
+              <w:right w:val="single" w:color="BBBBBB" w:sz="4"/>
+            </w:tcBorders>
+            <w:tcMar>
+              <w:top w:type="dxa" w:w="60"/>
+              <w:left w:type="dxa" w:w="90"/>
+              <w:bottom w:type="dxa" w:w="60"/>
+              <w:right w:type="dxa" w:w="90"/>
+            </w:tcMar>
+          </w:tcPr>
+          <w:p>
+            <w:pPr>
+              <w:bidi w:val="false"/>
+            </w:pPr>
+            <w:r>
+              <w:rPr>
+                <w:b/>
+                <w:bCs/>
+                <w:sz w:val="18"/>
+                <w:szCs w:val="18"/>
+                <w:rtl w:val="false"/>
+              </w:rPr>
+              <w:t xml:space="preserve">Done:</w:t>
+            </w:r>
+            <w:r>
+              <w:rPr>
+                <w:sz w:val="18"/>
+                <w:szCs w:val="18"/>
+                <w:rtl w:val="false"/>
+              </w:rPr>
+              <w:t xml:space="preserve"> typos, stray characters, lost line breaks, broken bold, honest drill and section counts, em-dashes</w:t>
+            </w:r>
+          </w:p>
+        </w:tc>
+        <w:tc>
+          <w:tcPr>
+            <w:tcW w:type="dxa" w:w="1145"/>
+            <w:tcBorders>
+              <w:top w:val="single" w:color="BBBBBB" w:sz="4"/>
+              <w:left w:val="single" w:color="BBBBBB" w:sz="4"/>
+              <w:bottom w:val="single" w:color="BBBBBB" w:sz="4"/>
+              <w:right w:val="single" w:color="BBBBBB" w:sz="4"/>
+            </w:tcBorders>
+            <w:tcMar>
+              <w:top w:type="dxa" w:w="60"/>
+              <w:left w:type="dxa" w:w="90"/>
+              <w:bottom w:type="dxa" w:w="60"/>
+              <w:right w:type="dxa" w:w="90"/>
+            </w:tcMar>
+          </w:tcPr>
+          <w:p>
+            <w:pPr>
+              <w:bidi w:val="false"/>
+            </w:pPr>
+            <w:r>
+              <w:rPr>
+                <w:sz w:val="18"/>
+                <w:szCs w:val="18"/>
+                <w:rtl w:val="false"/>
+              </w:rPr>
+              <w:t xml:space="preserve">4127989</w:t>
+            </w:r>
+          </w:p>
+        </w:tc>
+      </w:tr>
+      <w:tr>
+        <w:trPr>
+          <w:tblHeader w:val="off"/>
+        </w:trPr>
+        <w:tc>
+          <w:tcPr>
+            <w:tcW w:type="dxa" w:w="833"/>
+            <w:tcBorders>
+              <w:top w:val="single" w:color="BBBBBB" w:sz="4"/>
+              <w:left w:val="single" w:color="BBBBBB" w:sz="4"/>
+              <w:bottom w:val="single" w:color="BBBBBB" w:sz="4"/>
+              <w:right w:val="single" w:color="BBBBBB" w:sz="4"/>
+            </w:tcBorders>
+            <w:tcMar>
+              <w:top w:type="dxa" w:w="60"/>
+              <w:left w:type="dxa" w:w="90"/>
+              <w:bottom w:type="dxa" w:w="60"/>
+              <w:right w:type="dxa" w:w="90"/>
+            </w:tcMar>
+          </w:tcPr>
+          <w:p>
+            <w:pPr>
+              <w:bidi w:val="false"/>
+            </w:pPr>
+            <w:r>
+              <w:rPr>
+                <w:sz w:val="18"/>
+                <w:szCs w:val="18"/>
+                <w:rtl w:val="false"/>
+              </w:rPr>
+              <w:t xml:space="preserve">5</w:t>
+            </w:r>
+          </w:p>
+        </w:tc>
+        <w:tc>
+          <w:tcPr>
+            <w:tcW w:type="dxa" w:w="1146"/>
+            <w:tcBorders>
+              <w:top w:val="single" w:color="BBBBBB" w:sz="4"/>
+              <w:left w:val="single" w:color="BBBBBB" w:sz="4"/>
+              <w:bottom w:val="single" w:color="BBBBBB" w:sz="4"/>
+              <w:right w:val="single" w:color="BBBBBB" w:sz="4"/>
+            </w:tcBorders>
+            <w:tcMar>
+              <w:top w:type="dxa" w:w="60"/>
+              <w:left w:type="dxa" w:w="90"/>
+              <w:bottom w:type="dxa" w:w="60"/>
+              <w:right w:type="dxa" w:w="90"/>
+            </w:tcMar>
+          </w:tcPr>
+          <w:p>
+            <w:pPr>
+              <w:bidi w:val="false"/>
+            </w:pPr>
+            <w:r>
+              <w:rPr>
+                <w:sz w:val="18"/>
+                <w:szCs w:val="18"/>
+                <w:rtl w:val="false"/>
+              </w:rPr>
+              <w:t xml:space="preserve">P8 vocab gate</w:t>
+            </w:r>
+          </w:p>
+        </w:tc>
+        <w:tc>
+          <w:tcPr>
+            <w:tcW w:type="dxa" w:w="6236"/>
+            <w:tcBorders>
+              <w:top w:val="single" w:color="BBBBBB" w:sz="4"/>
+              <w:left w:val="single" w:color="BBBBBB" w:sz="4"/>
+              <w:bottom w:val="single" w:color="BBBBBB" w:sz="4"/>
+              <w:right w:val="single" w:color="BBBBBB" w:sz="4"/>
+            </w:tcBorders>
+            <w:tcMar>
+              <w:top w:type="dxa" w:w="60"/>
+              <w:left w:type="dxa" w:w="90"/>
+              <w:bottom w:type="dxa" w:w="60"/>
+              <w:right w:type="dxa" w:w="90"/>
+            </w:tcMar>
+          </w:tcPr>
+          <w:p>
+            <w:pPr>
+              <w:bidi w:val="false"/>
+            </w:pPr>
+            <w:r>
+              <w:rPr>
+                <w:b/>
+                <w:bCs/>
+                <w:sz w:val="18"/>
+                <w:szCs w:val="18"/>
+                <w:rtl w:val="false"/>
+              </w:rPr>
+              <w:t xml:space="preserve">Done:</w:t>
+            </w:r>
+            <w:r>
+              <w:rPr>
+                <w:sz w:val="18"/>
+                <w:szCs w:val="18"/>
+                <w:rtl w:val="false"/>
+              </w:rPr>
+              <w:t xml:space="preserve"> parallel track. l00's text and the audit's stated intent are updated</w:t>
+            </w:r>
+          </w:p>
+        </w:tc>
+        <w:tc>
+          <w:tcPr>
+            <w:tcW w:type="dxa" w:w="1145"/>
+            <w:tcBorders>
+              <w:top w:val="single" w:color="BBBBBB" w:sz="4"/>
+              <w:left w:val="single" w:color="BBBBBB" w:sz="4"/>
+              <w:bottom w:val="single" w:color="BBBBBB" w:sz="4"/>
+              <w:right w:val="single" w:color="BBBBBB" w:sz="4"/>
+            </w:tcBorders>
+            <w:tcMar>
+              <w:top w:type="dxa" w:w="60"/>
+              <w:left w:type="dxa" w:w="90"/>
+              <w:bottom w:type="dxa" w:w="60"/>
+              <w:right w:type="dxa" w:w="90"/>
+            </w:tcMar>
+          </w:tcPr>
+          <w:p>
+            <w:pPr>
+              <w:bidi w:val="false"/>
+            </w:pPr>
+            <w:r>
+              <w:rPr>
+                <w:sz w:val="18"/>
+                <w:szCs w:val="18"/>
+                <w:rtl w:val="false"/>
+              </w:rPr>
+              <w:t xml:space="preserve">4127989</w:t>
+            </w:r>
+          </w:p>
+        </w:tc>
+      </w:tr>
+      <w:tr>
+        <w:trPr>
+          <w:tblHeader w:val="off"/>
+        </w:trPr>
+        <w:tc>
+          <w:tcPr>
+            <w:tcW w:type="dxa" w:w="833"/>
+            <w:tcBorders>
+              <w:top w:val="single" w:color="BBBBBB" w:sz="4"/>
+              <w:left w:val="single" w:color="BBBBBB" w:sz="4"/>
+              <w:bottom w:val="single" w:color="BBBBBB" w:sz="4"/>
+              <w:right w:val="single" w:color="BBBBBB" w:sz="4"/>
+            </w:tcBorders>
+            <w:tcMar>
+              <w:top w:type="dxa" w:w="60"/>
+              <w:left w:type="dxa" w:w="90"/>
+              <w:bottom w:type="dxa" w:w="60"/>
+              <w:right w:type="dxa" w:w="90"/>
+            </w:tcMar>
+          </w:tcPr>
+          <w:p>
+            <w:pPr>
+              <w:bidi w:val="false"/>
+            </w:pPr>
+            <w:r>
+              <w:rPr>
+                <w:sz w:val="18"/>
+                <w:szCs w:val="18"/>
+                <w:rtl w:val="false"/>
+              </w:rPr>
+              <w:t xml:space="preserve">6</w:t>
+            </w:r>
+          </w:p>
+        </w:tc>
+        <w:tc>
+          <w:tcPr>
+            <w:tcW w:type="dxa" w:w="1146"/>
+            <w:tcBorders>
+              <w:top w:val="single" w:color="BBBBBB" w:sz="4"/>
+              <w:left w:val="single" w:color="BBBBBB" w:sz="4"/>
+              <w:bottom w:val="single" w:color="BBBBBB" w:sz="4"/>
+              <w:right w:val="single" w:color="BBBBBB" w:sz="4"/>
+            </w:tcBorders>
+            <w:tcMar>
+              <w:top w:type="dxa" w:w="60"/>
+              <w:left w:type="dxa" w:w="90"/>
+              <w:bottom w:type="dxa" w:w="60"/>
+              <w:right w:type="dxa" w:w="90"/>
+            </w:tcMar>
+          </w:tcPr>
+          <w:p>
+            <w:pPr>
+              <w:bidi w:val="false"/>
+            </w:pPr>
+            <w:r>
+              <w:rPr>
+                <w:sz w:val="18"/>
+                <w:szCs w:val="18"/>
+                <w:rtl w:val="false"/>
+              </w:rPr>
+              <w:t xml:space="preserve">P3 easy distractors (Part A)</w:t>
+            </w:r>
+          </w:p>
+        </w:tc>
+        <w:tc>
+          <w:tcPr>
+            <w:tcW w:type="dxa" w:w="6236"/>
+            <w:tcBorders>
+              <w:top w:val="single" w:color="BBBBBB" w:sz="4"/>
+              <w:left w:val="single" w:color="BBBBBB" w:sz="4"/>
+              <w:bottom w:val="single" w:color="BBBBBB" w:sz="4"/>
+              <w:right w:val="single" w:color="BBBBBB" w:sz="4"/>
+            </w:tcBorders>
+            <w:tcMar>
+              <w:top w:type="dxa" w:w="60"/>
+              <w:left w:type="dxa" w:w="90"/>
+              <w:bottom w:type="dxa" w:w="60"/>
+              <w:right w:type="dxa" w:w="90"/>
+            </w:tcMar>
+          </w:tcPr>
+          <w:p>
+            <w:pPr>
+              <w:bidi w:val="false"/>
+            </w:pPr>
+            <w:r>
+              <w:rPr>
+                <w:b/>
+                <w:bCs/>
+                <w:sz w:val="18"/>
+                <w:szCs w:val="18"/>
+                <w:rtl w:val="false"/>
+              </w:rPr>
+              <w:t xml:space="preserve">Done:</w:t>
+            </w:r>
+            <w:r>
+              <w:rPr>
+                <w:sz w:val="18"/>
+                <w:szCs w:val="18"/>
+                <w:rtl w:val="false"/>
+              </w:rPr>
+              <w:t xml:space="preserve"> about 35 items rewritten, each with an explanation</w:t>
+            </w:r>
+          </w:p>
+        </w:tc>
+        <w:tc>
+          <w:tcPr>
+            <w:tcW w:type="dxa" w:w="1145"/>
+            <w:tcBorders>
+              <w:top w:val="single" w:color="BBBBBB" w:sz="4"/>
+              <w:left w:val="single" w:color="BBBBBB" w:sz="4"/>
+              <w:bottom w:val="single" w:color="BBBBBB" w:sz="4"/>
+              <w:right w:val="single" w:color="BBBBBB" w:sz="4"/>
+            </w:tcBorders>
+            <w:tcMar>
+              <w:top w:type="dxa" w:w="60"/>
+              <w:left w:type="dxa" w:w="90"/>
+              <w:bottom w:type="dxa" w:w="60"/>
+              <w:right w:type="dxa" w:w="90"/>
+            </w:tcMar>
+          </w:tcPr>
+          <w:p>
+            <w:pPr>
+              <w:bidi w:val="false"/>
+            </w:pPr>
+            <w:r>
+              <w:rPr>
+                <w:sz w:val="18"/>
+                <w:szCs w:val="18"/>
+                <w:rtl w:val="false"/>
+              </w:rPr>
+              <w:t xml:space="preserve">48fabb0</w:t>
+            </w:r>
+          </w:p>
+        </w:tc>
+      </w:tr>
+      <w:tr>
+        <w:trPr>
+          <w:tblHeader w:val="off"/>
+        </w:trPr>
+        <w:tc>
+          <w:tcPr>
+            <w:tcW w:type="dxa" w:w="833"/>
+            <w:tcBorders>
+              <w:top w:val="single" w:color="BBBBBB" w:sz="4"/>
+              <w:left w:val="single" w:color="BBBBBB" w:sz="4"/>
+              <w:bottom w:val="single" w:color="BBBBBB" w:sz="4"/>
+              <w:right w:val="single" w:color="BBBBBB" w:sz="4"/>
+            </w:tcBorders>
+            <w:tcMar>
+              <w:top w:type="dxa" w:w="60"/>
+              <w:left w:type="dxa" w:w="90"/>
+              <w:bottom w:type="dxa" w:w="60"/>
+              <w:right w:type="dxa" w:w="90"/>
+            </w:tcMar>
+          </w:tcPr>
+          <w:p>
+            <w:pPr>
+              <w:bidi w:val="false"/>
+            </w:pPr>
+            <w:r>
+              <w:rPr>
+                <w:sz w:val="18"/>
+                <w:szCs w:val="18"/>
+                <w:rtl w:val="false"/>
+              </w:rPr>
+              <w:t xml:space="preserve">7</w:t>
+            </w:r>
+          </w:p>
+        </w:tc>
+        <w:tc>
+          <w:tcPr>
+            <w:tcW w:type="dxa" w:w="1146"/>
+            <w:tcBorders>
+              <w:top w:val="single" w:color="BBBBBB" w:sz="4"/>
+              <w:left w:val="single" w:color="BBBBBB" w:sz="4"/>
+              <w:bottom w:val="single" w:color="BBBBBB" w:sz="4"/>
+              <w:right w:val="single" w:color="BBBBBB" w:sz="4"/>
+            </w:tcBorders>
+            <w:tcMar>
+              <w:top w:type="dxa" w:w="60"/>
+              <w:left w:type="dxa" w:w="90"/>
+              <w:bottom w:type="dxa" w:w="60"/>
+              <w:right w:type="dxa" w:w="90"/>
+            </w:tcMar>
+          </w:tcPr>
+          <w:p>
+            <w:pPr>
+              <w:bidi w:val="false"/>
+            </w:pPr>
+            <w:r>
+              <w:rPr>
+                <w:sz w:val="18"/>
+                <w:szCs w:val="18"/>
+                <w:rtl w:val="false"/>
+              </w:rPr>
+              <w:t xml:space="preserve">Real final simulation</w:t>
+            </w:r>
+          </w:p>
+        </w:tc>
+        <w:tc>
+          <w:tcPr>
+            <w:tcW w:type="dxa" w:w="6236"/>
+            <w:tcBorders>
+              <w:top w:val="single" w:color="BBBBBB" w:sz="4"/>
+              <w:left w:val="single" w:color="BBBBBB" w:sz="4"/>
+              <w:bottom w:val="single" w:color="BBBBBB" w:sz="4"/>
+              <w:right w:val="single" w:color="BBBBBB" w:sz="4"/>
+            </w:tcBorders>
+            <w:tcMar>
+              <w:top w:type="dxa" w:w="60"/>
+              <w:left w:type="dxa" w:w="90"/>
+              <w:bottom w:type="dxa" w:w="60"/>
+              <w:right w:type="dxa" w:w="90"/>
+            </w:tcMar>
+          </w:tcPr>
+          <w:p>
+            <w:pPr>
+              <w:bidi w:val="false"/>
+            </w:pPr>
+            <w:r>
+              <w:rPr>
+                <w:sz w:val="18"/>
+                <w:szCs w:val="18"/>
+                <w:rtl w:val="false"/>
+              </w:rPr>
+              <w:t xml:space="preserve">Not started</w:t>
+            </w:r>
+          </w:p>
+        </w:tc>
+        <w:tc>
+          <w:tcPr>
+            <w:tcW w:type="dxa" w:w="1145"/>
+            <w:tcBorders>
+              <w:top w:val="single" w:color="BBBBBB" w:sz="4"/>
+              <w:left w:val="single" w:color="BBBBBB" w:sz="4"/>
+              <w:bottom w:val="single" w:color="BBBBBB" w:sz="4"/>
+              <w:right w:val="single" w:color="BBBBBB" w:sz="4"/>
+            </w:tcBorders>
+            <w:tcMar>
+              <w:top w:type="dxa" w:w="60"/>
+              <w:left w:type="dxa" w:w="90"/>
+              <w:bottom w:type="dxa" w:w="60"/>
+              <w:right w:type="dxa" w:w="90"/>
+            </w:tcMar>
+          </w:tcPr>
+          <w:p>
+            <w:pPr>
+              <w:bidi w:val="false"/>
+            </w:pPr>
+            <w:r>
+              <w:rPr>
+                <w:sz w:val="18"/>
+                <w:szCs w:val="18"/>
+                <w:rtl w:val="false"/>
+              </w:rPr>
+              <w:t xml:space="preserve">-</w:t>
+            </w:r>
+          </w:p>
+        </w:tc>
+      </w:tr>
+      <w:tr>
+        <w:trPr>
+          <w:tblHeader w:val="off"/>
+        </w:trPr>
+        <w:tc>
+          <w:tcPr>
+            <w:tcW w:type="dxa" w:w="833"/>
+            <w:tcBorders>
+              <w:top w:val="single" w:color="BBBBBB" w:sz="4"/>
+              <w:left w:val="single" w:color="BBBBBB" w:sz="4"/>
+              <w:bottom w:val="single" w:color="BBBBBB" w:sz="4"/>
+              <w:right w:val="single" w:color="BBBBBB" w:sz="4"/>
+            </w:tcBorders>
+            <w:tcMar>
+              <w:top w:type="dxa" w:w="60"/>
+              <w:left w:type="dxa" w:w="90"/>
+              <w:bottom w:type="dxa" w:w="60"/>
+              <w:right w:type="dxa" w:w="90"/>
+            </w:tcMar>
+          </w:tcPr>
+          <w:p>
+            <w:pPr>
+              <w:bidi w:val="false"/>
+            </w:pPr>
+            <w:r>
+              <w:rPr>
+                <w:sz w:val="18"/>
+                <w:szCs w:val="18"/>
+                <w:rtl w:val="false"/>
+              </w:rPr>
+              <w:t xml:space="preserve">8</w:t>
+            </w:r>
+          </w:p>
+        </w:tc>
+        <w:tc>
+          <w:tcPr>
+            <w:tcW w:type="dxa" w:w="1146"/>
+            <w:tcBorders>
+              <w:top w:val="single" w:color="BBBBBB" w:sz="4"/>
+              <w:left w:val="single" w:color="BBBBBB" w:sz="4"/>
+              <w:bottom w:val="single" w:color="BBBBBB" w:sz="4"/>
+              <w:right w:val="single" w:color="BBBBBB" w:sz="4"/>
+            </w:tcBorders>
+            <w:tcMar>
+              <w:top w:type="dxa" w:w="60"/>
+              <w:left w:type="dxa" w:w="90"/>
+              <w:bottom w:type="dxa" w:w="60"/>
+              <w:right w:type="dxa" w:w="90"/>
+            </w:tcMar>
+          </w:tcPr>
+          <w:p>
+            <w:pPr>
+              <w:bidi w:val="false"/>
+            </w:pPr>
+            <w:r>
+              <w:rPr>
+                <w:sz w:val="18"/>
+                <w:szCs w:val="18"/>
+                <w:rtl w:val="false"/>
+              </w:rPr>
+              <w:t xml:space="preserve">Scored written answers</w:t>
+            </w:r>
+          </w:p>
+        </w:tc>
+        <w:tc>
+          <w:tcPr>
+            <w:tcW w:type="dxa" w:w="6236"/>
+            <w:tcBorders>
+              <w:top w:val="single" w:color="BBBBBB" w:sz="4"/>
+              <w:left w:val="single" w:color="BBBBBB" w:sz="4"/>
+              <w:bottom w:val="single" w:color="BBBBBB" w:sz="4"/>
+              <w:right w:val="single" w:color="BBBBBB" w:sz="4"/>
+            </w:tcBorders>
+            <w:tcMar>
+              <w:top w:type="dxa" w:w="60"/>
+              <w:left w:type="dxa" w:w="90"/>
+              <w:bottom w:type="dxa" w:w="60"/>
+              <w:right w:type="dxa" w:w="90"/>
+            </w:tcMar>
+          </w:tcPr>
+          <w:p>
+            <w:pPr>
+              <w:bidi w:val="false"/>
+            </w:pPr>
+            <w:r>
+              <w:rPr>
+                <w:sz w:val="18"/>
+                <w:szCs w:val="18"/>
+                <w:rtl w:val="false"/>
+              </w:rPr>
+              <w:t xml:space="preserve">Not started. Spelling from memory (the spelling half of P5) is done, see step 11</w:t>
+            </w:r>
+          </w:p>
+        </w:tc>
+        <w:tc>
+          <w:tcPr>
+            <w:tcW w:type="dxa" w:w="1145"/>
+            <w:tcBorders>
+              <w:top w:val="single" w:color="BBBBBB" w:sz="4"/>
+              <w:left w:val="single" w:color="BBBBBB" w:sz="4"/>
+              <w:bottom w:val="single" w:color="BBBBBB" w:sz="4"/>
+              <w:right w:val="single" w:color="BBBBBB" w:sz="4"/>
+            </w:tcBorders>
+            <w:tcMar>
+              <w:top w:type="dxa" w:w="60"/>
+              <w:left w:type="dxa" w:w="90"/>
+              <w:bottom w:type="dxa" w:w="60"/>
+              <w:right w:type="dxa" w:w="90"/>
+            </w:tcMar>
+          </w:tcPr>
+          <w:p>
+            <w:pPr>
+              <w:bidi w:val="false"/>
+            </w:pPr>
+            <w:r>
+              <w:rPr>
+                <w:sz w:val="18"/>
+                <w:szCs w:val="18"/>
+                <w:rtl w:val="false"/>
+              </w:rPr>
+              <w:t xml:space="preserve">-</w:t>
+            </w:r>
+          </w:p>
+        </w:tc>
+      </w:tr>
+      <w:tr>
+        <w:trPr>
+          <w:tblHeader w:val="off"/>
+        </w:trPr>
+        <w:tc>
+          <w:tcPr>
+            <w:tcW w:type="dxa" w:w="833"/>
+            <w:tcBorders>
+              <w:top w:val="single" w:color="BBBBBB" w:sz="4"/>
+              <w:left w:val="single" w:color="BBBBBB" w:sz="4"/>
+              <w:bottom w:val="single" w:color="BBBBBB" w:sz="4"/>
+              <w:right w:val="single" w:color="BBBBBB" w:sz="4"/>
+            </w:tcBorders>
+            <w:tcMar>
+              <w:top w:type="dxa" w:w="60"/>
+              <w:left w:type="dxa" w:w="90"/>
+              <w:bottom w:type="dxa" w:w="60"/>
+              <w:right w:type="dxa" w:w="90"/>
+            </w:tcMar>
+          </w:tcPr>
+          <w:p>
+            <w:pPr>
+              <w:bidi w:val="false"/>
+            </w:pPr>
+            <w:r>
+              <w:rPr>
+                <w:sz w:val="18"/>
+                <w:szCs w:val="18"/>
+                <w:rtl w:val="false"/>
+              </w:rPr>
+              <w:t xml:space="preserve">9</w:t>
+            </w:r>
+          </w:p>
+        </w:tc>
+        <w:tc>
+          <w:tcPr>
+            <w:tcW w:type="dxa" w:w="1146"/>
+            <w:tcBorders>
+              <w:top w:val="single" w:color="BBBBBB" w:sz="4"/>
+              <w:left w:val="single" w:color="BBBBBB" w:sz="4"/>
+              <w:bottom w:val="single" w:color="BBBBBB" w:sz="4"/>
+              <w:right w:val="single" w:color="BBBBBB" w:sz="4"/>
+            </w:tcBorders>
+            <w:tcMar>
+              <w:top w:type="dxa" w:w="60"/>
+              <w:left w:type="dxa" w:w="90"/>
+              <w:bottom w:type="dxa" w:w="60"/>
+              <w:right w:type="dxa" w:w="90"/>
+            </w:tcMar>
+          </w:tcPr>
+          <w:p>
+            <w:pPr>
+              <w:bidi w:val="false"/>
+            </w:pPr>
+            <w:r>
+              <w:rPr>
+                <w:sz w:val="18"/>
+                <w:szCs w:val="18"/>
+                <w:rtl w:val="false"/>
+              </w:rPr>
+              <w:t xml:space="preserve">Required fresh-text rounds (P6)</w:t>
+            </w:r>
+          </w:p>
+        </w:tc>
+        <w:tc>
+          <w:tcPr>
+            <w:tcW w:type="dxa" w:w="6236"/>
+            <w:tcBorders>
+              <w:top w:val="single" w:color="BBBBBB" w:sz="4"/>
+              <w:left w:val="single" w:color="BBBBBB" w:sz="4"/>
+              <w:bottom w:val="single" w:color="BBBBBB" w:sz="4"/>
+              <w:right w:val="single" w:color="BBBBBB" w:sz="4"/>
+            </w:tcBorders>
+            <w:tcMar>
+              <w:top w:type="dxa" w:w="60"/>
+              <w:left w:type="dxa" w:w="90"/>
+              <w:bottom w:type="dxa" w:w="60"/>
+              <w:right w:type="dxa" w:w="90"/>
+            </w:tcMar>
+          </w:tcPr>
+          <w:p>
+            <w:pPr>
+              <w:bidi w:val="false"/>
+            </w:pPr>
+            <w:r>
+              <w:rPr>
+                <w:b/>
+                <w:bCs/>
+                <w:sz w:val="18"/>
+                <w:szCs w:val="18"/>
+                <w:rtl w:val="false"/>
+              </w:rPr>
+              <w:t xml:space="preserve">In progress.</w:t>
+            </w:r>
+            <w:r>
+              <w:rPr>
+                <w:sz w:val="18"/>
+                <w:szCs w:val="18"/>
+                <w:rtl w:val="false"/>
+              </w:rPr>
+              <w:t xml:space="preserve"> The pattern is agreed and written in </w:t>
+            </w:r>
+            <w:r>
+              <w:rPr>
+                <w:rFonts w:ascii="Consolas" w:cs="Consolas" w:eastAsia="Consolas" w:hAnsi="Consolas"/>
+                <w:sz w:val="19"/>
+                <w:szCs w:val="19"/>
+                <w:rtl w:val="false"/>
+              </w:rPr>
+              <w:t xml:space="preserve">docs/lesson-structure.md</w:t>
+            </w:r>
+            <w:r>
+              <w:rPr>
+                <w:sz w:val="18"/>
+                <w:szCs w:val="18"/>
+                <w:rtl w:val="false"/>
+              </w:rPr>
+              <w:t xml:space="preserve"> ("Reading round pattern"). Done: l06 + not-q (reference implementation) and l08 + n-b46b7e2b</w:t>
+            </w:r>
+          </w:p>
+        </w:tc>
+        <w:tc>
+          <w:tcPr>
+            <w:tcW w:type="dxa" w:w="1145"/>
+            <w:tcBorders>
+              <w:top w:val="single" w:color="BBBBBB" w:sz="4"/>
+              <w:left w:val="single" w:color="BBBBBB" w:sz="4"/>
+              <w:bottom w:val="single" w:color="BBBBBB" w:sz="4"/>
+              <w:right w:val="single" w:color="BBBBBB" w:sz="4"/>
+            </w:tcBorders>
+            <w:tcMar>
+              <w:top w:type="dxa" w:w="60"/>
+              <w:left w:type="dxa" w:w="90"/>
+              <w:bottom w:type="dxa" w:w="60"/>
+              <w:right w:type="dxa" w:w="90"/>
+            </w:tcMar>
+          </w:tcPr>
+          <w:p>
+            <w:pPr>
+              <w:bidi w:val="false"/>
+            </w:pPr>
+            <w:r>
+              <w:rPr>
+                <w:sz w:val="18"/>
+                <w:szCs w:val="18"/>
+                <w:rtl w:val="false"/>
+              </w:rPr>
+              <w:t xml:space="preserve">12587ad, 99303c2, e2cad79, 585865e</w:t>
+            </w:r>
+          </w:p>
+        </w:tc>
+      </w:tr>
+      <w:tr>
+        <w:trPr>
+          <w:tblHeader w:val="off"/>
+        </w:trPr>
+        <w:tc>
+          <w:tcPr>
+            <w:tcW w:type="dxa" w:w="833"/>
+            <w:tcBorders>
+              <w:top w:val="single" w:color="BBBBBB" w:sz="4"/>
+              <w:left w:val="single" w:color="BBBBBB" w:sz="4"/>
+              <w:bottom w:val="single" w:color="BBBBBB" w:sz="4"/>
+              <w:right w:val="single" w:color="BBBBBB" w:sz="4"/>
+            </w:tcBorders>
+            <w:tcMar>
+              <w:top w:type="dxa" w:w="60"/>
+              <w:left w:type="dxa" w:w="90"/>
+              <w:bottom w:type="dxa" w:w="60"/>
+              <w:right w:type="dxa" w:w="90"/>
+            </w:tcMar>
+          </w:tcPr>
+          <w:p>
+            <w:pPr>
+              <w:bidi w:val="false"/>
+            </w:pPr>
+            <w:r>
+              <w:rPr>
+                <w:sz w:val="18"/>
+                <w:szCs w:val="18"/>
+                <w:rtl w:val="false"/>
+              </w:rPr>
+              <w:t xml:space="preserve">10</w:t>
+            </w:r>
+          </w:p>
+        </w:tc>
+        <w:tc>
+          <w:tcPr>
+            <w:tcW w:type="dxa" w:w="1146"/>
+            <w:tcBorders>
+              <w:top w:val="single" w:color="BBBBBB" w:sz="4"/>
+              <w:left w:val="single" w:color="BBBBBB" w:sz="4"/>
+              <w:bottom w:val="single" w:color="BBBBBB" w:sz="4"/>
+              <w:right w:val="single" w:color="BBBBBB" w:sz="4"/>
+            </w:tcBorders>
+            <w:tcMar>
+              <w:top w:type="dxa" w:w="60"/>
+              <w:left w:type="dxa" w:w="90"/>
+              <w:bottom w:type="dxa" w:w="60"/>
+              <w:right w:type="dxa" w:w="90"/>
+            </w:tcMar>
+          </w:tcPr>
+          <w:p>
+            <w:pPr>
+              <w:bidi w:val="false"/>
+            </w:pPr>
+            <w:r>
+              <w:rPr>
+                <w:sz w:val="18"/>
+                <w:szCs w:val="18"/>
+                <w:rtl w:val="false"/>
+              </w:rPr>
+              <w:t xml:space="preserve">Runner-level timer</w:t>
+            </w:r>
+          </w:p>
+        </w:tc>
+        <w:tc>
+          <w:tcPr>
+            <w:tcW w:type="dxa" w:w="6236"/>
+            <w:tcBorders>
+              <w:top w:val="single" w:color="BBBBBB" w:sz="4"/>
+              <w:left w:val="single" w:color="BBBBBB" w:sz="4"/>
+              <w:bottom w:val="single" w:color="BBBBBB" w:sz="4"/>
+              <w:right w:val="single" w:color="BBBBBB" w:sz="4"/>
+            </w:tcBorders>
+            <w:tcMar>
+              <w:top w:type="dxa" w:w="60"/>
+              <w:left w:type="dxa" w:w="90"/>
+              <w:bottom w:type="dxa" w:w="60"/>
+              <w:right w:type="dxa" w:w="90"/>
+            </w:tcMar>
+          </w:tcPr>
+          <w:p>
+            <w:pPr>
+              <w:bidi w:val="false"/>
+            </w:pPr>
+            <w:r>
+              <w:rPr>
+                <w:sz w:val="18"/>
+                <w:szCs w:val="18"/>
+                <w:rtl w:val="false"/>
+              </w:rPr>
+              <w:t xml:space="preserve">Not started. Needed by step 7</w:t>
+            </w:r>
+          </w:p>
+        </w:tc>
+        <w:tc>
+          <w:tcPr>
+            <w:tcW w:type="dxa" w:w="1145"/>
+            <w:tcBorders>
+              <w:top w:val="single" w:color="BBBBBB" w:sz="4"/>
+              <w:left w:val="single" w:color="BBBBBB" w:sz="4"/>
+              <w:bottom w:val="single" w:color="BBBBBB" w:sz="4"/>
+              <w:right w:val="single" w:color="BBBBBB" w:sz="4"/>
+            </w:tcBorders>
+            <w:tcMar>
+              <w:top w:type="dxa" w:w="60"/>
+              <w:left w:type="dxa" w:w="90"/>
+              <w:bottom w:type="dxa" w:w="60"/>
+              <w:right w:type="dxa" w:w="90"/>
+            </w:tcMar>
+          </w:tcPr>
+          <w:p>
+            <w:pPr>
+              <w:bidi w:val="false"/>
+            </w:pPr>
+            <w:r>
+              <w:rPr>
+                <w:sz w:val="18"/>
+                <w:szCs w:val="18"/>
+                <w:rtl w:val="false"/>
+              </w:rPr>
+              <w:t xml:space="preserve">-</w:t>
+            </w:r>
+          </w:p>
+        </w:tc>
+      </w:tr>
+      <w:tr>
+        <w:trPr>
+          <w:tblHeader w:val="off"/>
+        </w:trPr>
+        <w:tc>
+          <w:tcPr>
+            <w:tcW w:type="dxa" w:w="833"/>
+            <w:tcBorders>
+              <w:top w:val="single" w:color="BBBBBB" w:sz="4"/>
+              <w:left w:val="single" w:color="BBBBBB" w:sz="4"/>
+              <w:bottom w:val="single" w:color="BBBBBB" w:sz="4"/>
+              <w:right w:val="single" w:color="BBBBBB" w:sz="4"/>
+            </w:tcBorders>
+            <w:tcMar>
+              <w:top w:type="dxa" w:w="60"/>
+              <w:left w:type="dxa" w:w="90"/>
+              <w:bottom w:type="dxa" w:w="60"/>
+              <w:right w:type="dxa" w:w="90"/>
+            </w:tcMar>
+          </w:tcPr>
+          <w:p>
+            <w:pPr>
+              <w:bidi w:val="false"/>
+            </w:pPr>
+            <w:r>
+              <w:rPr>
+                <w:sz w:val="18"/>
+                <w:szCs w:val="18"/>
+                <w:rtl w:val="false"/>
+              </w:rPr>
+              <w:t xml:space="preserve">11</w:t>
+            </w:r>
+          </w:p>
+        </w:tc>
+        <w:tc>
+          <w:tcPr>
+            <w:tcW w:type="dxa" w:w="1146"/>
+            <w:tcBorders>
+              <w:top w:val="single" w:color="BBBBBB" w:sz="4"/>
+              <w:left w:val="single" w:color="BBBBBB" w:sz="4"/>
+              <w:bottom w:val="single" w:color="BBBBBB" w:sz="4"/>
+              <w:right w:val="single" w:color="BBBBBB" w:sz="4"/>
+            </w:tcBorders>
+            <w:tcMar>
+              <w:top w:type="dxa" w:w="60"/>
+              <w:left w:type="dxa" w:w="90"/>
+              <w:bottom w:type="dxa" w:w="60"/>
+              <w:right w:type="dxa" w:w="90"/>
+            </w:tcMar>
+          </w:tcPr>
+          <w:p>
+            <w:pPr>
+              <w:bidi w:val="false"/>
+            </w:pPr>
+            <w:r>
+              <w:rPr>
+                <w:sz w:val="18"/>
+                <w:szCs w:val="18"/>
+                <w:rtl w:val="false"/>
+              </w:rPr>
+              <w:t xml:space="preserve">Part A placement + listen spelling</w:t>
+            </w:r>
+          </w:p>
+        </w:tc>
+        <w:tc>
+          <w:tcPr>
+            <w:tcW w:type="dxa" w:w="6236"/>
+            <w:tcBorders>
+              <w:top w:val="single" w:color="BBBBBB" w:sz="4"/>
+              <w:left w:val="single" w:color="BBBBBB" w:sz="4"/>
+              <w:bottom w:val="single" w:color="BBBBBB" w:sz="4"/>
+              <w:right w:val="single" w:color="BBBBBB" w:sz="4"/>
+            </w:tcBorders>
+            <w:tcMar>
+              <w:top w:type="dxa" w:w="60"/>
+              <w:left w:type="dxa" w:w="90"/>
+              <w:bottom w:type="dxa" w:w="60"/>
+              <w:right w:type="dxa" w:w="90"/>
+            </w:tcMar>
+          </w:tcPr>
+          <w:p>
+            <w:pPr>
+              <w:bidi w:val="false"/>
+            </w:pPr>
+            <w:r>
+              <w:rPr>
+                <w:b/>
+                <w:bCs/>
+                <w:sz w:val="18"/>
+                <w:szCs w:val="18"/>
+                <w:rtl w:val="false"/>
+              </w:rPr>
+              <w:t xml:space="preserve">Half done:</w:t>
+            </w:r>
+            <w:r>
+              <w:rPr>
+                <w:sz w:val="18"/>
+                <w:szCs w:val="18"/>
+                <w:rtl w:val="false"/>
+              </w:rPr>
+              <w:t xml:space="preserve"> 48 listen-mode spelling screens with a Hebrew hint, and a fallback to copy mode. Placement check not started</w:t>
+            </w:r>
+          </w:p>
+        </w:tc>
+        <w:tc>
+          <w:tcPr>
+            <w:tcW w:type="dxa" w:w="1145"/>
+            <w:tcBorders>
+              <w:top w:val="single" w:color="BBBBBB" w:sz="4"/>
+              <w:left w:val="single" w:color="BBBBBB" w:sz="4"/>
+              <w:bottom w:val="single" w:color="BBBBBB" w:sz="4"/>
+              <w:right w:val="single" w:color="BBBBBB" w:sz="4"/>
+            </w:tcBorders>
+            <w:tcMar>
+              <w:top w:type="dxa" w:w="60"/>
+              <w:left w:type="dxa" w:w="90"/>
+              <w:bottom w:type="dxa" w:w="60"/>
+              <w:right w:type="dxa" w:w="90"/>
+            </w:tcMar>
+          </w:tcPr>
+          <w:p>
+            <w:pPr>
+              <w:bidi w:val="false"/>
+            </w:pPr>
+            <w:r>
+              <w:rPr>
+                <w:sz w:val="18"/>
+                <w:szCs w:val="18"/>
+                <w:rtl w:val="false"/>
+              </w:rPr>
+              <w:t xml:space="preserve">7d98015</w:t>
+            </w:r>
+          </w:p>
+        </w:tc>
+      </w:tr>
+      <w:tr>
+        <w:trPr>
+          <w:tblHeader w:val="off"/>
+        </w:trPr>
+        <w:tc>
+          <w:tcPr>
+            <w:tcW w:type="dxa" w:w="833"/>
+            <w:tcBorders>
+              <w:top w:val="single" w:color="BBBBBB" w:sz="4"/>
+              <w:left w:val="single" w:color="BBBBBB" w:sz="4"/>
+              <w:bottom w:val="single" w:color="BBBBBB" w:sz="4"/>
+              <w:right w:val="single" w:color="BBBBBB" w:sz="4"/>
+            </w:tcBorders>
+            <w:tcMar>
+              <w:top w:type="dxa" w:w="60"/>
+              <w:left w:type="dxa" w:w="90"/>
+              <w:bottom w:type="dxa" w:w="60"/>
+              <w:right w:type="dxa" w:w="90"/>
+            </w:tcMar>
+          </w:tcPr>
+          <w:p>
+            <w:pPr>
+              <w:bidi w:val="false"/>
+            </w:pPr>
+            <w:r>
+              <w:rPr>
+                <w:sz w:val="18"/>
+                <w:szCs w:val="18"/>
+                <w:rtl w:val="false"/>
+              </w:rPr>
+              <w:t xml:space="preserve">12</w:t>
+            </w:r>
+          </w:p>
+        </w:tc>
+        <w:tc>
+          <w:tcPr>
+            <w:tcW w:type="dxa" w:w="1146"/>
+            <w:tcBorders>
+              <w:top w:val="single" w:color="BBBBBB" w:sz="4"/>
+              <w:left w:val="single" w:color="BBBBBB" w:sz="4"/>
+              <w:bottom w:val="single" w:color="BBBBBB" w:sz="4"/>
+              <w:right w:val="single" w:color="BBBBBB" w:sz="4"/>
+            </w:tcBorders>
+            <w:tcMar>
+              <w:top w:type="dxa" w:w="60"/>
+              <w:left w:type="dxa" w:w="90"/>
+              <w:bottom w:type="dxa" w:w="60"/>
+              <w:right w:type="dxa" w:w="90"/>
+            </w:tcMar>
+          </w:tcPr>
+          <w:p>
+            <w:pPr>
+              <w:bidi w:val="false"/>
+            </w:pPr>
+            <w:r>
+              <w:rPr>
+                <w:sz w:val="18"/>
+                <w:szCs w:val="18"/>
+                <w:rtl w:val="false"/>
+              </w:rPr>
+              <w:t xml:space="preserve">Split numbers-names-q; drills</w:t>
+            </w:r>
+          </w:p>
+        </w:tc>
+        <w:tc>
+          <w:tcPr>
+            <w:tcW w:type="dxa" w:w="6236"/>
+            <w:tcBorders>
+              <w:top w:val="single" w:color="BBBBBB" w:sz="4"/>
+              <w:left w:val="single" w:color="BBBBBB" w:sz="4"/>
+              <w:bottom w:val="single" w:color="BBBBBB" w:sz="4"/>
+              <w:right w:val="single" w:color="BBBBBB" w:sz="4"/>
+            </w:tcBorders>
+            <w:tcMar>
+              <w:top w:type="dxa" w:w="60"/>
+              <w:left w:type="dxa" w:w="90"/>
+              <w:bottom w:type="dxa" w:w="60"/>
+              <w:right w:type="dxa" w:w="90"/>
+            </w:tcMar>
+          </w:tcPr>
+          <w:p>
+            <w:pPr>
+              <w:bidi w:val="false"/>
+            </w:pPr>
+            <w:r>
+              <w:rPr>
+                <w:sz w:val="18"/>
+                <w:szCs w:val="18"/>
+                <w:rtl w:val="false"/>
+              </w:rPr>
+              <w:t xml:space="preserve">Replaced by the P6 pattern. numbers-names-q is handled in P6 pair 3</w:t>
+            </w:r>
+          </w:p>
+        </w:tc>
+        <w:tc>
+          <w:tcPr>
+            <w:tcW w:type="dxa" w:w="1145"/>
+            <w:tcBorders>
+              <w:top w:val="single" w:color="BBBBBB" w:sz="4"/>
+              <w:left w:val="single" w:color="BBBBBB" w:sz="4"/>
+              <w:bottom w:val="single" w:color="BBBBBB" w:sz="4"/>
+              <w:right w:val="single" w:color="BBBBBB" w:sz="4"/>
+            </w:tcBorders>
+            <w:tcMar>
+              <w:top w:type="dxa" w:w="60"/>
+              <w:left w:type="dxa" w:w="90"/>
+              <w:bottom w:type="dxa" w:w="60"/>
+              <w:right w:type="dxa" w:w="90"/>
+            </w:tcMar>
+          </w:tcPr>
+          <w:p>
+            <w:pPr>
+              <w:bidi w:val="false"/>
+            </w:pPr>
+            <w:r>
+              <w:rPr>
+                <w:sz w:val="18"/>
+                <w:szCs w:val="18"/>
+                <w:rtl w:val="false"/>
+              </w:rPr>
+              <w:t xml:space="preserve">-</w:t>
+            </w:r>
+          </w:p>
+        </w:tc>
+      </w:tr>
+      <w:tr>
+        <w:trPr>
+          <w:tblHeader w:val="off"/>
+        </w:trPr>
+        <w:tc>
+          <w:tcPr>
+            <w:tcW w:type="dxa" w:w="833"/>
+            <w:tcBorders>
+              <w:top w:val="single" w:color="BBBBBB" w:sz="4"/>
+              <w:left w:val="single" w:color="BBBBBB" w:sz="4"/>
+              <w:bottom w:val="single" w:color="BBBBBB" w:sz="4"/>
+              <w:right w:val="single" w:color="BBBBBB" w:sz="4"/>
+            </w:tcBorders>
+            <w:tcMar>
+              <w:top w:type="dxa" w:w="60"/>
+              <w:left w:type="dxa" w:w="90"/>
+              <w:bottom w:type="dxa" w:w="60"/>
+              <w:right w:type="dxa" w:w="90"/>
+            </w:tcMar>
+          </w:tcPr>
+          <w:p>
+            <w:pPr>
+              <w:bidi w:val="false"/>
+            </w:pPr>
+            <w:r>
+              <w:rPr>
+                <w:sz w:val="18"/>
+                <w:szCs w:val="18"/>
+                <w:rtl w:val="false"/>
+              </w:rPr>
+              <w:t xml:space="preserve">13</w:t>
+            </w:r>
+          </w:p>
+        </w:tc>
+        <w:tc>
+          <w:tcPr>
+            <w:tcW w:type="dxa" w:w="1146"/>
+            <w:tcBorders>
+              <w:top w:val="single" w:color="BBBBBB" w:sz="4"/>
+              <w:left w:val="single" w:color="BBBBBB" w:sz="4"/>
+              <w:bottom w:val="single" w:color="BBBBBB" w:sz="4"/>
+              <w:right w:val="single" w:color="BBBBBB" w:sz="4"/>
+            </w:tcBorders>
+            <w:tcMar>
+              <w:top w:type="dxa" w:w="60"/>
+              <w:left w:type="dxa" w:w="90"/>
+              <w:bottom w:type="dxa" w:w="60"/>
+              <w:right w:type="dxa" w:w="90"/>
+            </w:tcMar>
+          </w:tcPr>
+          <w:p>
+            <w:pPr>
+              <w:bidi w:val="false"/>
+            </w:pPr>
+            <w:r>
+              <w:rPr>
+                <w:sz w:val="18"/>
+                <w:szCs w:val="18"/>
+                <w:rtl w:val="false"/>
+              </w:rPr>
+              <w:t xml:space="preserve">Play-test with students</w:t>
+            </w:r>
+          </w:p>
+        </w:tc>
+        <w:tc>
+          <w:tcPr>
+            <w:tcW w:type="dxa" w:w="6236"/>
+            <w:tcBorders>
+              <w:top w:val="single" w:color="BBBBBB" w:sz="4"/>
+              <w:left w:val="single" w:color="BBBBBB" w:sz="4"/>
+              <w:bottom w:val="single" w:color="BBBBBB" w:sz="4"/>
+              <w:right w:val="single" w:color="BBBBBB" w:sz="4"/>
+            </w:tcBorders>
+            <w:tcMar>
+              <w:top w:type="dxa" w:w="60"/>
+              <w:left w:type="dxa" w:w="90"/>
+              <w:bottom w:type="dxa" w:w="60"/>
+              <w:right w:type="dxa" w:w="90"/>
+            </w:tcMar>
+          </w:tcPr>
+          <w:p>
+            <w:pPr>
+              <w:bidi w:val="false"/>
+            </w:pPr>
+            <w:r>
+              <w:rPr>
+                <w:sz w:val="18"/>
+                <w:szCs w:val="18"/>
+                <w:rtl w:val="false"/>
+              </w:rPr>
+              <w:t xml:space="preserve">Not started</w:t>
+            </w:r>
+          </w:p>
+        </w:tc>
+        <w:tc>
+          <w:tcPr>
+            <w:tcW w:type="dxa" w:w="1145"/>
+            <w:tcBorders>
+              <w:top w:val="single" w:color="BBBBBB" w:sz="4"/>
+              <w:left w:val="single" w:color="BBBBBB" w:sz="4"/>
+              <w:bottom w:val="single" w:color="BBBBBB" w:sz="4"/>
+              <w:right w:val="single" w:color="BBBBBB" w:sz="4"/>
+            </w:tcBorders>
+            <w:tcMar>
+              <w:top w:type="dxa" w:w="60"/>
+              <w:left w:type="dxa" w:w="90"/>
+              <w:bottom w:type="dxa" w:w="60"/>
+              <w:right w:type="dxa" w:w="90"/>
+            </w:tcMar>
+          </w:tcPr>
+          <w:p>
+            <w:pPr>
+              <w:bidi w:val="false"/>
+            </w:pPr>
+            <w:r>
+              <w:rPr>
+                <w:sz w:val="18"/>
+                <w:szCs w:val="18"/>
+                <w:rtl w:val="false"/>
+              </w:rPr>
+              <w:t xml:space="preserve">-</w:t>
+            </w:r>
+          </w:p>
+        </w:tc>
+      </w:tr>
+    </w:tbl>
+    <w:p>
+      <w:pPr>
+        <w:spacing w:after="80"/>
+      </w:pPr>
+    </w:p>
+    <w:p>
+      <w:pPr>
+        <w:pStyle w:val="Heading2"/>
+      </w:pPr>
+      <w:r>
+        <w:rPr>
+          <w:rtl w:val="false"/>
+        </w:rPr>
+        <w:t xml:space="preserve">Owner decisions made during implementation</w:t>
+      </w:r>
+    </w:p>
+    <w:p>
+      <w:pPr>
+        <w:pStyle w:val="ListParagraph"/>
+        <w:numPr>
+          <w:ilvl w:val="0"/>
+          <w:numId w:val="2"/>
+        </w:numPr>
+        <w:bidi w:val="false"/>
+        <w:spacing w:after="60"/>
+      </w:pPr>
+      <w:r>
+        <w:rPr>
+          <w:b/>
+          <w:bCs/>
+          <w:rtl w:val="false"/>
+        </w:rPr>
+        <w:t xml:space="preserve">Rounds:</w:t>
+      </w:r>
+      <w:r>
+        <w:rPr>
+          <w:rtl/>
+        </w:rPr>
+        <w:t xml:space="preserve"> everything up to and including the exam-level round is required. Later rounds are optional and labelled "תרגול נוסף (רשות)".</w:t>
+      </w:r>
+    </w:p>
+    <w:p>
+      <w:pPr>
+        <w:pStyle w:val="ListParagraph"/>
+        <w:numPr>
+          <w:ilvl w:val="0"/>
+          <w:numId w:val="2"/>
+        </w:numPr>
+        <w:bidi w:val="false"/>
+        <w:spacing w:after="60"/>
+      </w:pPr>
+      <w:r>
+        <w:rPr>
+          <w:b/>
+          <w:bCs/>
+          <w:rtl w:val="false"/>
+        </w:rPr>
+        <w:t xml:space="preserve">Marking lessons (drills) stay about marking.</w:t>
+      </w:r>
+      <w:r>
+        <w:rPr>
+          <w:rtl w:val="false"/>
+        </w:rPr>
+        <w:t xml:space="preserve"> They get 2 rules questions from the paired question lesson, and the ~240-word marking text is their own last round.</w:t>
+      </w:r>
+    </w:p>
+    <w:p>
+      <w:pPr>
+        <w:pStyle w:val="ListParagraph"/>
+        <w:numPr>
+          <w:ilvl w:val="0"/>
+          <w:numId w:val="2"/>
+        </w:numPr>
+        <w:bidi w:val="false"/>
+        <w:spacing w:after="60"/>
+      </w:pPr>
+      <w:r>
+        <w:rPr>
+          <w:b/>
+          <w:bCs/>
+          <w:rtl w:val="false"/>
+        </w:rPr>
+        <w:t xml:space="preserve">Question lessons:</w:t>
+      </w:r>
+    </w:p>
+    <w:p>
+      <w:pPr>
+        <w:pStyle w:val="ListParagraph"/>
+        <w:numPr>
+          <w:ilvl w:val="1"/>
+          <w:numId w:val="2"/>
+        </w:numPr>
+        <w:bidi w:val="false"/>
+        <w:spacing w:after="60"/>
+      </w:pPr>
+      <w:r>
+        <w:rPr>
+          <w:rtl w:val="false"/>
+        </w:rPr>
+        <w:t xml:space="preserve">Round 1: rules questions plus a short text with one question.</w:t>
+      </w:r>
+    </w:p>
+    <w:p>
+      <w:pPr>
+        <w:pStyle w:val="ListParagraph"/>
+        <w:numPr>
+          <w:ilvl w:val="1"/>
+          <w:numId w:val="2"/>
+        </w:numPr>
+        <w:bidi w:val="false"/>
+        <w:spacing w:after="60"/>
+      </w:pPr>
+      <w:r>
+        <w:rPr>
+          <w:rtl w:val="false"/>
+        </w:rPr>
+        <w:t xml:space="preserve">Round 2: your turn.</w:t>
+      </w:r>
+    </w:p>
+    <w:p>
+      <w:pPr>
+        <w:pStyle w:val="ListParagraph"/>
+        <w:numPr>
+          <w:ilvl w:val="1"/>
+          <w:numId w:val="2"/>
+        </w:numPr>
+        <w:bidi w:val="false"/>
+        <w:spacing w:after="60"/>
+      </w:pPr>
+      <w:r>
+        <w:rPr>
+          <w:rtl w:val="false"/>
+        </w:rPr>
+        <w:t xml:space="preserve">Round 3: exam level, a familiar passage (about 4 questions) plus a new text (3 questions).</w:t>
+      </w:r>
+    </w:p>
+    <w:p>
+      <w:pPr>
+        <w:pStyle w:val="ListParagraph"/>
+        <w:numPr>
+          <w:ilvl w:val="1"/>
+          <w:numId w:val="2"/>
+        </w:numPr>
+        <w:bidi w:val="false"/>
+        <w:spacing w:after="60"/>
+      </w:pPr>
+      <w:r>
+        <w:rPr>
+          <w:rtl w:val="false"/>
+        </w:rPr>
+        <w:t xml:space="preserve">The owner merged the worked-example round into the exam round.</w:t>
+      </w:r>
+    </w:p>
+    <w:p>
+      <w:pPr>
+        <w:pStyle w:val="ListParagraph"/>
+        <w:numPr>
+          <w:ilvl w:val="0"/>
+          <w:numId w:val="2"/>
+        </w:numPr>
+        <w:bidi w:val="false"/>
+        <w:spacing w:after="60"/>
+      </w:pPr>
+      <w:r>
+        <w:rPr>
+          <w:b/>
+          <w:bCs/>
+          <w:rtl w:val="false"/>
+        </w:rPr>
+        <w:t xml:space="preserve">Spelling:</w:t>
+      </w:r>
+      <w:r>
+        <w:rPr>
+          <w:rtl w:val="false"/>
+        </w:rPr>
+        <w:t xml:space="preserve"> copy mode stays for weak students, and listen mode is added later in each lesson.</w:t>
+      </w:r>
+    </w:p>
+    <w:p>
+      <w:pPr>
+        <w:pStyle w:val="ListParagraph"/>
+        <w:numPr>
+          <w:ilvl w:val="0"/>
+          <w:numId w:val="2"/>
+        </w:numPr>
+        <w:bidi w:val="false"/>
+        <w:spacing w:after="60"/>
+      </w:pPr>
+      <w:r>
+        <w:rPr>
+          <w:b/>
+          <w:bCs/>
+          <w:rtl w:val="false"/>
+        </w:rPr>
+        <w:t xml:space="preserve">Vocabulary:</w:t>
+      </w:r>
+      <w:r>
+        <w:rPr>
+          <w:rtl w:val="false"/>
+        </w:rPr>
+        <w:t xml:space="preserve"> runs in parallel with reading, with no gate.</w:t>
+      </w:r>
+    </w:p>
+    <w:p>
+      <w:pPr>
+        <w:pStyle w:val="Heading2"/>
+      </w:pPr>
+      <w:r>
+        <w:rPr>
+          <w:rtl w:val="false"/>
+        </w:rPr>
+        <w:t xml:space="preserve">Resume here (P6 rollout)</w:t>
+      </w:r>
+    </w:p>
+    <w:p>
+      <w:pPr>
+        <w:pStyle w:val="ListParagraph"/>
+        <w:numPr>
+          <w:ilvl w:val="0"/>
+          <w:numId w:val="8"/>
+        </w:numPr>
+        <w:bidi w:val="false"/>
+        <w:spacing w:after="60"/>
+      </w:pPr>
+      <w:r>
+        <w:rPr>
+          <w:b/>
+          <w:bCs/>
+          <w:rtl w:val="false"/>
+        </w:rPr>
+        <w:t xml:space="preserve">Pair 2: l07 + limiters-q.</w:t>
+      </w:r>
+      <w:r>
+        <w:rPr>
+          <w:rtl w:val="false"/>
+        </w:rPr>
+        <w:t xml:space="preserve"> Apply the pattern and fix P2's </w:t>
+      </w:r>
+      <w:r>
+        <w:rPr>
+          <w:i/>
+          <w:iCs/>
+          <w:rtl w:val="false"/>
+        </w:rPr>
+        <w:t xml:space="preserve">most</w:t>
+      </w:r>
+      <w:r>
+        <w:rPr>
+          <w:rtl w:val="false"/>
+        </w:rPr>
+        <w:t xml:space="preserve">: </w:t>
+      </w:r>
+      <w:r>
+        <w:rPr>
+          <w:i/>
+          <w:iCs/>
+          <w:rtl w:val="false"/>
+        </w:rPr>
+        <w:t xml:space="preserve">the most / the only / the main</w:t>
+      </w:r>
+      <w:r>
+        <w:rPr>
+          <w:rtl w:val="false"/>
+        </w:rPr>
+        <w:t xml:space="preserve"> limit to one answer, but </w:t>
+      </w:r>
+      <w:r>
+        <w:rPr>
+          <w:i/>
+          <w:iCs/>
+          <w:rtl w:val="false"/>
+        </w:rPr>
+        <w:t xml:space="preserve">most</w:t>
+      </w:r>
+      <w:r>
+        <w:rPr>
+          <w:rtl w:val="false"/>
+        </w:rPr>
+        <w:t xml:space="preserve"> + noun means a majority. Write a new ~240-word marking text and a new exam text.</w:t>
+      </w:r>
+    </w:p>
+    <w:p>
+      <w:pPr>
+        <w:pStyle w:val="ListParagraph"/>
+        <w:numPr>
+          <w:ilvl w:val="0"/>
+          <w:numId w:val="8"/>
+        </w:numPr>
+        <w:bidi w:val="false"/>
+        <w:spacing w:after="60"/>
+      </w:pPr>
+      <w:r>
+        <w:rPr>
+          <w:b/>
+          <w:bCs/>
+          <w:rtl w:val="false"/>
+        </w:rPr>
+        <w:t xml:space="preserve">Pair 3: l04 + numbers-names-q.</w:t>
+      </w:r>
+      <w:r>
+        <w:rPr>
+          <w:rtl w:val="false"/>
+        </w:rPr>
+        <w:t xml:space="preserve"> Keep it one lesson:</w:t>
+      </w:r>
+    </w:p>
+    <w:p>
+      <w:pPr>
+        <w:pStyle w:val="ListParagraph"/>
+        <w:numPr>
+          <w:ilvl w:val="1"/>
+          <w:numId w:val="2"/>
+        </w:numPr>
+        <w:bidi w:val="false"/>
+        <w:spacing w:after="60"/>
+      </w:pPr>
+      <w:r>
+        <w:rPr>
+          <w:rtl w:val="false"/>
+        </w:rPr>
+        <w:t xml:space="preserve">Round 1: rules for numbers and names, plus a short text.</w:t>
+      </w:r>
+    </w:p>
+    <w:p>
+      <w:pPr>
+        <w:pStyle w:val="ListParagraph"/>
+        <w:numPr>
+          <w:ilvl w:val="1"/>
+          <w:numId w:val="2"/>
+        </w:numPr>
+        <w:bidi w:val="false"/>
+        <w:spacing w:after="60"/>
+      </w:pPr>
+      <w:r>
+        <w:rPr>
+          <w:rtl w:val="false"/>
+        </w:rPr>
+        <w:t xml:space="preserve">Round 2: your turn with numbers.</w:t>
+      </w:r>
+    </w:p>
+    <w:p>
+      <w:pPr>
+        <w:pStyle w:val="ListParagraph"/>
+        <w:numPr>
+          <w:ilvl w:val="1"/>
+          <w:numId w:val="2"/>
+        </w:numPr>
+        <w:bidi w:val="false"/>
+        <w:spacing w:after="60"/>
+      </w:pPr>
+      <w:r>
+        <w:rPr>
+          <w:rtl w:val="false"/>
+        </w:rPr>
+        <w:t xml:space="preserve">Round 3: your turn with names.</w:t>
+      </w:r>
+    </w:p>
+    <w:p>
+      <w:pPr>
+        <w:pStyle w:val="ListParagraph"/>
+        <w:numPr>
+          <w:ilvl w:val="1"/>
+          <w:numId w:val="2"/>
+        </w:numPr>
+        <w:bidi w:val="false"/>
+        <w:spacing w:after="60"/>
+      </w:pPr>
+      <w:r>
+        <w:rPr>
+          <w:rtl w:val="false"/>
+        </w:rPr>
+        <w:t xml:space="preserve">Round 4: exam level (mixed questions plus a new text).</w:t>
+      </w:r>
+    </w:p>
+    <w:p>
+      <w:pPr>
+        <w:pStyle w:val="ListParagraph"/>
+        <w:numPr>
+          <w:ilvl w:val="1"/>
+          <w:numId w:val="2"/>
+        </w:numPr>
+        <w:bidi w:val="false"/>
+        <w:spacing w:after="60"/>
+      </w:pPr>
+      <w:r>
+        <w:rPr>
+          <w:rtl w:val="false"/>
+        </w:rPr>
+        <w:t xml:space="preserve">Optional rounds after that. Delete both 🌱 rounds.</w:t>
+      </w:r>
+    </w:p>
+    <w:p>
+      <w:pPr>
+        <w:pStyle w:val="ListParagraph"/>
+        <w:numPr>
+          <w:ilvl w:val="0"/>
+          <w:numId w:val="9"/>
+        </w:numPr>
+        <w:bidi w:val="false"/>
+        <w:spacing w:after="60"/>
+      </w:pPr>
+      <w:r>
+        <w:rPr>
+          <w:b/>
+          <w:bCs/>
+          <w:rtl w:val="false"/>
+        </w:rPr>
+        <w:t xml:space="preserve">Single lessons l01-l03, l09-l12:</w:t>
+      </w:r>
+      <w:r>
+        <w:rPr>
+          <w:rtl w:val="false"/>
+        </w:rPr>
+        <w:t xml:space="preserve"> delete the 🌱 rounds, make sure the exam round has a new text, and set </w:t>
+      </w:r>
+      <w:r>
+        <w:rPr>
+          <w:rFonts w:ascii="Consolas" w:cs="Consolas" w:eastAsia="Consolas" w:hAnsi="Consolas"/>
+          <w:sz w:val="19"/>
+          <w:szCs w:val="19"/>
+          <w:rtl w:val="false"/>
+        </w:rPr>
+        <w:t xml:space="preserve">requiredRounds</w:t>
+      </w:r>
+      <w:r>
+        <w:rPr>
+          <w:rtl w:val="false"/>
+        </w:rPr>
+        <w:t xml:space="preserve"> to the exam round. For l00, delete only the filler, and fix its "I search, I don't read" summary line (step 2).</w:t>
+      </w:r>
+    </w:p>
+    <w:p>
+      <w:pPr>
+        <w:pStyle w:val="ListParagraph"/>
+        <w:numPr>
+          <w:ilvl w:val="0"/>
+          <w:numId w:val="9"/>
+        </w:numPr>
+        <w:bidi w:val="false"/>
+        <w:spacing w:after="60"/>
+      </w:pPr>
+      <w:r>
+        <w:rPr>
+          <w:b/>
+          <w:bCs/>
+          <w:rtl w:val="false"/>
+        </w:rPr>
+        <w:t xml:space="preserve">Then Phase 3:</w:t>
+      </w:r>
+      <w:r>
+        <w:rPr>
+          <w:rtl w:val="false"/>
+        </w:rPr>
+        <w:t xml:space="preserve"> the final simulation (step 7, needs step 10) and scored written answers (step 8). They can reuse the new texts written during P6.</w:t>
+      </w:r>
+    </w:p>
+    <w:p>
+      <w:pPr>
+        <w:bidi w:val="false"/>
+        <w:spacing w:after="100"/>
+      </w:pPr>
+      <w:r>
+        <w:rPr>
+          <w:rtl w:val="false"/>
+        </w:rPr>
+        <w:t xml:space="preserve">New texts written so far (each used in only one lesson):</w:t>
+      </w:r>
+    </w:p>
+    <w:p>
+      <w:pPr>
+        <w:pStyle w:val="ListParagraph"/>
+        <w:numPr>
+          <w:ilvl w:val="0"/>
+          <w:numId w:val="2"/>
+        </w:numPr>
+        <w:bidi w:val="false"/>
+        <w:spacing w:after="60"/>
+      </w:pPr>
+      <w:r>
+        <w:rPr>
+          <w:rtl w:val="false"/>
+        </w:rPr>
+        <w:t xml:space="preserve">PHONES IN THE LOCKER (not-q)</w:t>
+      </w:r>
+    </w:p>
+    <w:p>
+      <w:pPr>
+        <w:pStyle w:val="ListParagraph"/>
+        <w:numPr>
+          <w:ilvl w:val="0"/>
+          <w:numId w:val="2"/>
+        </w:numPr>
+        <w:bidi w:val="false"/>
+        <w:spacing w:after="60"/>
+      </w:pPr>
+      <w:r>
+        <w:rPr>
+          <w:rtl w:val="false"/>
+        </w:rPr>
+        <w:t xml:space="preserve">Oakton bridge (not-q)</w:t>
+      </w:r>
+    </w:p>
+    <w:p>
+      <w:pPr>
+        <w:pStyle w:val="ListParagraph"/>
+        <w:numPr>
+          <w:ilvl w:val="0"/>
+          <w:numId w:val="2"/>
+        </w:numPr>
+        <w:bidi w:val="false"/>
+        <w:spacing w:after="60"/>
+      </w:pPr>
+      <w:r>
+        <w:rPr>
+          <w:rtl w:val="false"/>
+        </w:rPr>
+        <w:t xml:space="preserve">Brookfield car-free street (l06, marking)</w:t>
+      </w:r>
+    </w:p>
+    <w:p>
+      <w:pPr>
+        <w:pStyle w:val="ListParagraph"/>
+        <w:numPr>
+          <w:ilvl w:val="0"/>
+          <w:numId w:val="2"/>
+        </w:numPr>
+        <w:bidi w:val="false"/>
+        <w:spacing w:after="60"/>
+      </w:pPr>
+      <w:r>
+        <w:rPr>
+          <w:rtl w:val="false"/>
+        </w:rPr>
+        <w:t xml:space="preserve">Clearwater four-day week (l08, marking)</w:t>
+      </w:r>
+    </w:p>
+    <w:p>
+      <w:pPr>
+        <w:pStyle w:val="ListParagraph"/>
+        <w:numPr>
+          <w:ilvl w:val="0"/>
+          <w:numId w:val="2"/>
+        </w:numPr>
+        <w:bidi w:val="false"/>
+        <w:spacing w:after="60"/>
+      </w:pPr>
+      <w:r>
+        <w:rPr>
+          <w:rtl w:val="false"/>
+        </w:rPr>
+        <w:t xml:space="preserve">museum trip (n-b46b7e2b)</w:t>
+      </w:r>
+    </w:p>
+    <w:p>
+      <w:pPr>
+        <w:pStyle w:val="ListParagraph"/>
+        <w:numPr>
+          <w:ilvl w:val="0"/>
+          <w:numId w:val="2"/>
+        </w:numPr>
+        <w:bidi w:val="false"/>
+        <w:spacing w:after="60"/>
+      </w:pPr>
+      <w:r>
+        <w:rPr>
+          <w:rtl w:val="false"/>
+        </w:rPr>
+        <w:t xml:space="preserve">THE NIGHT MARKET (n-b46b7e2b)</w:t>
+      </w:r>
+    </w:p>
+    <w:p>
+      <w:pPr>
+        <w:pStyle w:val="Heading2"/>
+      </w:pPr>
+      <w:r>
+        <w:rPr>
+          <w:rtl w:val="false"/>
+        </w:rPr>
+        <w:t xml:space="preserve">Known side effects</w:t>
+      </w:r>
+    </w:p>
+    <w:p>
+      <w:pPr>
+        <w:pStyle w:val="ListParagraph"/>
+        <w:numPr>
+          <w:ilvl w:val="0"/>
+          <w:numId w:val="2"/>
+        </w:numPr>
+        <w:bidi w:val="false"/>
+        <w:spacing w:after="60"/>
+      </w:pPr>
+      <w:r>
+        <w:rPr>
+          <w:b/>
+          <w:bCs/>
+          <w:rtl w:val="false"/>
+        </w:rPr>
+        <w:t xml:space="preserve">Relocked lessons:</w:t>
+      </w:r>
+      <w:r>
+        <w:rPr>
+          <w:rtl w:val="false"/>
+        </w:rPr>
+        <w:t xml:space="preserve"> students partway through a changed lesson may find the next lesson locked again, because more rounds are now required.</w:t>
+      </w:r>
+    </w:p>
+    <w:p>
+      <w:pPr>
+        <w:pStyle w:val="ListParagraph"/>
+        <w:numPr>
+          <w:ilvl w:val="0"/>
+          <w:numId w:val="2"/>
+        </w:numPr>
+        <w:bidi w:val="false"/>
+        <w:spacing w:after="60"/>
+      </w:pPr>
+      <w:r>
+        <w:rPr>
+          <w:b/>
+          <w:bCs/>
+          <w:rtl w:val="false"/>
+        </w:rPr>
+        <w:t xml:space="preserve">Nothing played yet:</w:t>
+      </w:r>
+      <w:r>
+        <w:rPr>
+          <w:rtl w:val="false"/>
+        </w:rPr>
+        <w:t xml:space="preserve"> the changed screens pass the type check, and the marking positions are verified by script, but none have been played on a device. Locations are in the chat log and </w:t>
+      </w:r>
+      <w:r>
+        <w:rPr>
+          <w:rFonts w:ascii="Consolas" w:cs="Consolas" w:eastAsia="Consolas" w:hAnsi="Consolas"/>
+          <w:sz w:val="19"/>
+          <w:szCs w:val="19"/>
+          <w:rtl w:val="false"/>
+        </w:rPr>
+        <w:t xml:space="preserve">docs/module-c-audit.md</w:t>
+      </w:r>
+      <w:r>
+        <w:rPr>
+          <w:rtl w:val="false"/>
+        </w:rPr>
+        <w:t xml:space="preserve">.</w:t>
       </w:r>
     </w:p>
     <w:sectPr>
@@ -15323,6 +18909,18 @@
     </w:lvlOverride>
   </w:num>
   <w:num w:numId="7">
+    <w:abstractNumId w:val="3"/>
+    <w:lvlOverride w:ilvl="0">
+      <w:startOverride w:val="1"/>
+    </w:lvlOverride>
+  </w:num>
+  <w:num w:numId="8">
+    <w:abstractNumId w:val="3"/>
+    <w:lvlOverride w:ilvl="0">
+      <w:startOverride w:val="1"/>
+    </w:lvlOverride>
+  </w:num>
+  <w:num w:numId="9">
     <w:abstractNumId w:val="3"/>
     <w:lvlOverride w:ilvl="0">
       <w:startOverride w:val="1"/>

</xml_diff>